<commit_message>
Update My Resume file
</commit_message>
<xml_diff>
--- a/MyResumes/Amgad-Galaom-Software-Engineer.docx
+++ b/MyResumes/Amgad-Galaom-Software-Engineer.docx
@@ -298,7 +298,6 @@
         <w:jc w:val="both"/>
         <w:rPr>
           <w:rFonts w:ascii="Segoe UI" w:eastAsia="Arial" w:hAnsi="Segoe UI" w:cs="Segoe UI"/>
-          <w:b/>
           <w:color w:val="000000"/>
           <w:sz w:val="22"/>
         </w:rPr>
@@ -309,7 +308,26 @@
           <w:color w:val="000000"/>
           <w:sz w:val="22"/>
         </w:rPr>
-        <w:t>Motivated and detail-oriented TALL-Stack and Desktop Developer with a Bachelor’s degree in Computer Science and proven experience as a Practical Labs Instructor. Skilled in full-stack web development using Tailwind, Alpine JS, Laravel, Livewire, and MySQL, with strong expertise in object-oriented programming and algorithmic problem-solving. Experienced in delivering hands-on labs in Python (Data Mining), C++ (Programming Fundamentals), and C# (Operating Systems), reinforcing core concepts such as supervised/unsupervised learning, debugging, concurrency, and kernel programming. Adept at designing technical workflows, mentoring students, and implementing scalable solutions across web and desktop environments. Committed to continuous learning, professional growth, and contributing technical skills to dynamic development teams and real-world projects.</w:t>
+        <w:t xml:space="preserve">Motivated and detail-oriented TALL-Stack and Desktop Developer with a Bachelor’s degree in Computer Science and proven experience as a Practical Labs Instructor. Skilled in full-stack web development using Tailwind, Alpine JS, Laravel, Livewire, and MySQL, with strong expertise in object-oriented programming and algorithmic problem-solving. </w:t>
+      </w:r>
+    </w:p>
+    <w:p>
+      <w:pPr>
+        <w:jc w:val="both"/>
+        <w:rPr>
+          <w:rFonts w:ascii="Segoe UI" w:eastAsia="Arial" w:hAnsi="Segoe UI" w:cs="Segoe UI"/>
+          <w:b/>
+          <w:color w:val="000000"/>
+          <w:sz w:val="22"/>
+        </w:rPr>
+      </w:pPr>
+      <w:r>
+        <w:rPr>
+          <w:rFonts w:ascii="Segoe UI" w:eastAsia="Arial" w:hAnsi="Segoe UI" w:cs="Segoe UI"/>
+          <w:color w:val="000000"/>
+          <w:sz w:val="22"/>
+        </w:rPr>
+        <w:t>Experienced in delivering hands-on labs in Python (Data Mining), C++ (Programming Fundamentals), and C# (Operating Systems), reinforcing core concepts such as supervised/unsupervised learning, debugging, concurrency, and kernel programming. Adept at designing technical workflows, mentoring students, and implementing scalable solutions across web and desktop environments. Committed to continuous learning, professional growth, and contributing technical skills to dynamic development teams and real-world projects.</w:t>
       </w:r>
     </w:p>
     <w:p>
@@ -1283,6 +1301,7 @@
           <w:bdr w:val="none" w:sz="0" w:space="0" w:color="auto" w:frame="1"/>
           <w:lang w:eastAsia="en-US"/>
         </w:rPr>
+        <w:lastRenderedPageBreak/>
         <w:t xml:space="preserve">Mentorship and feedback on debugging techniques  </w:t>
       </w:r>
     </w:p>
@@ -1339,7 +1358,6 @@
           <w:sz w:val="22"/>
           <w:szCs w:val="28"/>
         </w:rPr>
-        <w:lastRenderedPageBreak/>
         <w:t xml:space="preserve">Key projects supervised:  </w:t>
       </w:r>
     </w:p>
@@ -1539,7 +1557,6 @@
         </w:rPr>
       </w:pPr>
       <w:hyperlink r:id="rId8" w:history="1">
-        <w:proofErr w:type="spellStart"/>
         <w:r>
           <w:rPr>
             <w:rFonts w:ascii="Arial" w:eastAsia="MS Gothic" w:hAnsi="Arial" w:cs="Times New Roman (Headings CS)"/>
@@ -1547,11 +1564,11 @@
             <w:color w:val="auto"/>
             <w:sz w:val="22"/>
             <w:szCs w:val="28"/>
+            <w:u w:val="single"/>
             <w:lang w:eastAsia="en-US"/>
           </w:rPr>
-          <w:t>YemenIN</w:t>
+          <w:t>DVLD Management System</w:t>
         </w:r>
-        <w:proofErr w:type="spellEnd"/>
         <w:r>
           <w:rPr>
             <w:rFonts w:ascii="Arial" w:eastAsia="MS Gothic" w:hAnsi="Arial" w:cs="Times New Roman (Headings CS)"/>
@@ -1585,7 +1602,7 @@
           <w:szCs w:val="28"/>
           <w:lang w:eastAsia="en-US"/>
         </w:rPr>
-        <w:t>Oct</w:t>
+        <w:t>Dec</w:t>
       </w:r>
       <w:r>
         <w:rPr>
@@ -1596,7 +1613,7 @@
           <w:szCs w:val="28"/>
           <w:lang w:eastAsia="en-US"/>
         </w:rPr>
-        <w:t xml:space="preserve"> 2024 – </w:t>
+        <w:t xml:space="preserve"> 202</w:t>
       </w:r>
       <w:r>
         <w:rPr>
@@ -1607,7 +1624,7 @@
           <w:szCs w:val="28"/>
           <w:lang w:eastAsia="en-US"/>
         </w:rPr>
-        <w:t>Sep</w:t>
+        <w:t>5</w:t>
       </w:r>
       <w:r>
         <w:rPr>
@@ -1618,7 +1635,7 @@
           <w:szCs w:val="28"/>
           <w:lang w:eastAsia="en-US"/>
         </w:rPr>
-        <w:t xml:space="preserve"> 2025</w:t>
+        <w:t xml:space="preserve"> – </w:t>
       </w:r>
       <w:r>
         <w:rPr>
@@ -1629,6 +1646,39 @@
           <w:szCs w:val="28"/>
           <w:lang w:eastAsia="en-US"/>
         </w:rPr>
+        <w:t>May</w:t>
+      </w:r>
+      <w:r>
+        <w:rPr>
+          <w:rFonts w:ascii="Arial" w:eastAsia="MS Gothic" w:hAnsi="Arial" w:cs="Times New Roman (Headings CS)"/>
+          <w:b/>
+          <w:color w:val="auto"/>
+          <w:sz w:val="22"/>
+          <w:szCs w:val="28"/>
+          <w:lang w:eastAsia="en-US"/>
+        </w:rPr>
+        <w:t xml:space="preserve"> 202</w:t>
+      </w:r>
+      <w:r>
+        <w:rPr>
+          <w:rFonts w:ascii="Arial" w:eastAsia="MS Gothic" w:hAnsi="Arial" w:cs="Times New Roman (Headings CS)"/>
+          <w:b/>
+          <w:color w:val="auto"/>
+          <w:sz w:val="22"/>
+          <w:szCs w:val="28"/>
+          <w:lang w:eastAsia="en-US"/>
+        </w:rPr>
+        <w:t>6</w:t>
+      </w:r>
+      <w:r>
+        <w:rPr>
+          <w:rFonts w:ascii="Arial" w:eastAsia="MS Gothic" w:hAnsi="Arial" w:cs="Times New Roman (Headings CS)"/>
+          <w:b/>
+          <w:color w:val="auto"/>
+          <w:sz w:val="22"/>
+          <w:szCs w:val="28"/>
+          <w:lang w:eastAsia="en-US"/>
+        </w:rPr>
         <w:t>)</w:t>
       </w:r>
     </w:p>
@@ -1636,19 +1686,19 @@
       <w:pPr>
         <w:rPr>
           <w:rFonts w:ascii="Arial" w:eastAsia="Arial" w:hAnsi="Arial" w:cs="Arial"/>
-          <w:color w:val="000000"/>
-          <w:sz w:val="22"/>
-          <w:szCs w:val="24"/>
-        </w:rPr>
-      </w:pPr>
-      <w:r>
-        <w:rPr>
-          <w:rFonts w:ascii="Arial" w:eastAsia="Arial" w:hAnsi="Arial" w:cs="Arial"/>
-          <w:color w:val="000000"/>
-          <w:sz w:val="22"/>
-          <w:szCs w:val="24"/>
-        </w:rPr>
-        <w:t>A modern web platform that combines social media networking with AI-powered career guidance, designed as a beta simulation similar to LinkedIn.</w:t>
+          <w:color w:val="auto"/>
+          <w:sz w:val="22"/>
+          <w:szCs w:val="24"/>
+        </w:rPr>
+      </w:pPr>
+      <w:r>
+        <w:rPr>
+          <w:rFonts w:ascii="Arial" w:eastAsia="Arial" w:hAnsi="Arial" w:cs="Arial"/>
+          <w:color w:val="auto"/>
+          <w:sz w:val="22"/>
+          <w:szCs w:val="24"/>
+        </w:rPr>
+        <w:t>A comprehensive desktop management application built in C# and Windows Forms to digitize and automate the operations of the Driver and Vehicle Licensing Directorate (DVLD).</w:t>
       </w:r>
     </w:p>
     <w:p>
@@ -1658,7 +1708,7 @@
         <w:jc w:val="both"/>
         <w:rPr>
           <w:rFonts w:ascii="Arial" w:eastAsia="Arial" w:hAnsi="Arial" w:cs="Arial"/>
-          <w:color w:val="000000"/>
+          <w:color w:val="auto"/>
           <w:sz w:val="22"/>
           <w:szCs w:val="24"/>
         </w:rPr>
@@ -1668,7 +1718,7 @@
           <w:rFonts w:ascii="Segoe UI" w:eastAsia="MS Gothic" w:hAnsi="Segoe UI" w:cs="Segoe UI"/>
           <w:b/>
           <w:bCs/>
-          <w:color w:val="191919"/>
+          <w:color w:val="auto"/>
           <w:sz w:val="22"/>
           <w:szCs w:val="28"/>
         </w:rPr>
@@ -1677,7 +1727,7 @@
       <w:r>
         <w:rPr>
           <w:rFonts w:ascii="Segoe UI" w:eastAsia="MS Gothic" w:hAnsi="Segoe UI" w:cs="Segoe UI"/>
-          <w:color w:val="191919"/>
+          <w:color w:val="auto"/>
           <w:sz w:val="22"/>
           <w:szCs w:val="28"/>
         </w:rPr>
@@ -1686,11 +1736,11 @@
       <w:r>
         <w:rPr>
           <w:rFonts w:ascii="Arial" w:eastAsia="Arial" w:hAnsi="Arial" w:cs="Arial"/>
-          <w:color w:val="000000"/>
-          <w:sz w:val="22"/>
-          <w:szCs w:val="24"/>
-        </w:rPr>
-        <w:t>Livewire, Laravel, Alpine.js, Bootstrap and MySQL.</w:t>
+          <w:color w:val="auto"/>
+          <w:sz w:val="22"/>
+          <w:szCs w:val="24"/>
+        </w:rPr>
+        <w:t>C#, WinForms, SQL Server, ADO.NET.</w:t>
       </w:r>
     </w:p>
     <w:p>
@@ -1700,7 +1750,7 @@
         <w:jc w:val="both"/>
         <w:rPr>
           <w:rFonts w:ascii="Arial" w:eastAsia="Arial" w:hAnsi="Arial" w:cs="Arial"/>
-          <w:color w:val="000000"/>
+          <w:color w:val="auto"/>
           <w:sz w:val="22"/>
           <w:szCs w:val="24"/>
           <w:lang w:bidi="ar-YE"/>
@@ -1709,146 +1759,11 @@
       <w:r>
         <w:rPr>
           <w:rFonts w:ascii="Arial" w:eastAsia="Arial" w:hAnsi="Arial" w:cs="Arial"/>
-          <w:color w:val="000000"/>
-          <w:sz w:val="22"/>
-          <w:szCs w:val="24"/>
-        </w:rPr>
-        <w:t xml:space="preserve">As a team project I </w:t>
-      </w:r>
-      <w:r>
-        <w:rPr>
-          <w:rFonts w:ascii="Arial" w:eastAsia="Arial" w:hAnsi="Arial" w:cs="Arial"/>
-          <w:color w:val="000000"/>
-          <w:sz w:val="22"/>
-          <w:szCs w:val="24"/>
-        </w:rPr>
-        <w:t>participated in developing</w:t>
-      </w:r>
-      <w:r>
-        <w:rPr>
-          <w:rFonts w:ascii="Arial" w:eastAsia="Arial" w:hAnsi="Arial" w:cs="Arial"/>
-          <w:color w:val="000000"/>
-          <w:sz w:val="22"/>
-          <w:szCs w:val="24"/>
-        </w:rPr>
-        <w:t xml:space="preserve"> the Laravel/MySQL </w:t>
-      </w:r>
-      <w:r>
-        <w:rPr>
-          <w:rFonts w:ascii="Arial" w:eastAsia="Arial" w:hAnsi="Arial" w:cs="Arial"/>
-          <w:color w:val="000000"/>
-          <w:sz w:val="22"/>
-          <w:szCs w:val="24"/>
-        </w:rPr>
-        <w:t>tables schema</w:t>
-      </w:r>
-      <w:r>
-        <w:rPr>
-          <w:rFonts w:ascii="Arial" w:eastAsia="Arial" w:hAnsi="Arial" w:cs="Arial"/>
-          <w:color w:val="000000"/>
-          <w:sz w:val="22"/>
-          <w:szCs w:val="24"/>
-        </w:rPr>
-        <w:t xml:space="preserve"> and data model for posts, jobs, and </w:t>
-      </w:r>
-      <w:r>
-        <w:rPr>
-          <w:rFonts w:ascii="Arial" w:eastAsia="Arial" w:hAnsi="Arial" w:cs="Arial"/>
-          <w:color w:val="000000"/>
-          <w:sz w:val="22"/>
-          <w:szCs w:val="24"/>
-        </w:rPr>
-        <w:t>etc.</w:t>
-      </w:r>
-      <w:r>
-        <w:rPr>
-          <w:rFonts w:ascii="Arial" w:eastAsia="Arial" w:hAnsi="Arial" w:cs="Arial"/>
-          <w:color w:val="000000"/>
-          <w:sz w:val="22"/>
-          <w:szCs w:val="24"/>
-        </w:rPr>
-        <w:t xml:space="preserve"> </w:t>
-      </w:r>
-      <w:r>
-        <w:rPr>
-          <w:rFonts w:ascii="Arial" w:eastAsia="Arial" w:hAnsi="Arial" w:cs="Arial"/>
-          <w:color w:val="000000"/>
-          <w:sz w:val="22"/>
-          <w:szCs w:val="24"/>
-        </w:rPr>
-        <w:t>O</w:t>
-      </w:r>
-      <w:r>
-        <w:rPr>
-          <w:rFonts w:ascii="Arial" w:eastAsia="Arial" w:hAnsi="Arial" w:cs="Arial"/>
-          <w:color w:val="000000"/>
-          <w:sz w:val="22"/>
-          <w:szCs w:val="24"/>
-        </w:rPr>
-        <w:t>ptimized key queries and added indexes to reduce page load times noticeably.</w:t>
-      </w:r>
-      <w:r>
-        <w:rPr>
-          <w:rFonts w:ascii="Arial" w:eastAsia="Arial" w:hAnsi="Arial" w:cs="Arial"/>
-          <w:color w:val="000000"/>
-          <w:sz w:val="22"/>
-          <w:szCs w:val="24"/>
-        </w:rPr>
-        <w:t xml:space="preserve"> </w:t>
-      </w:r>
-      <w:r>
-        <w:rPr>
-          <w:rFonts w:ascii="Arial" w:eastAsia="Arial" w:hAnsi="Arial" w:cs="Arial"/>
-          <w:color w:val="000000"/>
-          <w:sz w:val="22"/>
-          <w:szCs w:val="24"/>
-        </w:rPr>
-        <w:t>I</w:t>
-      </w:r>
-      <w:r>
-        <w:rPr>
-          <w:rFonts w:ascii="Arial" w:eastAsia="Arial" w:hAnsi="Arial" w:cs="Arial"/>
-          <w:color w:val="000000"/>
-          <w:sz w:val="22"/>
-          <w:szCs w:val="24"/>
-        </w:rPr>
-        <w:t xml:space="preserve"> also</w:t>
-      </w:r>
-      <w:r>
-        <w:rPr>
-          <w:rFonts w:ascii="Arial" w:eastAsia="Arial" w:hAnsi="Arial" w:cs="Arial"/>
-          <w:color w:val="000000"/>
-          <w:sz w:val="22"/>
-          <w:szCs w:val="24"/>
-        </w:rPr>
-        <w:t xml:space="preserve"> i</w:t>
-      </w:r>
-      <w:r>
-        <w:rPr>
-          <w:rFonts w:ascii="Arial" w:eastAsia="Arial" w:hAnsi="Arial" w:cs="Arial"/>
-          <w:color w:val="000000"/>
-          <w:sz w:val="22"/>
-          <w:szCs w:val="24"/>
-        </w:rPr>
-        <w:t>mplemented real</w:t>
-      </w:r>
-      <w:r>
-        <w:rPr>
-          <w:rFonts w:ascii="Cambria Math" w:eastAsia="Arial" w:hAnsi="Cambria Math" w:cs="Cambria Math"/>
-          <w:color w:val="000000"/>
-          <w:sz w:val="22"/>
-          <w:szCs w:val="24"/>
-        </w:rPr>
-        <w:t>‑</w:t>
-      </w:r>
-      <w:r>
-        <w:rPr>
-          <w:rFonts w:ascii="Arial" w:eastAsia="Arial" w:hAnsi="Arial" w:cs="Arial"/>
-          <w:color w:val="000000"/>
-          <w:sz w:val="22"/>
-          <w:szCs w:val="24"/>
-        </w:rPr>
-        <w:t>time UI updates with Livewire + Alpine.js to enable instant post/comment reactions and live chat. Led integration of job postings into the main feed to increase discoverability and reduce navigation friction.</w:t>
+          <w:color w:val="auto"/>
+          <w:sz w:val="22"/>
+          <w:szCs w:val="24"/>
+        </w:rPr>
+        <w:t>Engineered an enterprise-grade DVLD management system using 3-Tier Architecture and ADO.NET. Automated complex workflows, including multi-stage testing pipelines and license lifecycles, while enforcing strict business rules and granular audit trails to ensure system-wide data integrity and accountability.</w:t>
       </w:r>
     </w:p>
     <w:p>
@@ -1859,12 +1774,220 @@
           <w:tab w:val="right" w:pos="9360"/>
         </w:tabs>
         <w:spacing w:before="180" w:after="0"/>
+        <w:outlineLvl w:val="1"/>
+        <w:rPr>
+          <w:rStyle w:val="Hyperlink"/>
+          <w:rFonts w:ascii="Arial" w:eastAsia="MS Gothic" w:hAnsi="Arial" w:cs="Times New Roman (Headings CS)"/>
+          <w:b/>
+          <w:color w:val="auto"/>
+          <w:sz w:val="22"/>
+          <w:szCs w:val="28"/>
+          <w:lang w:eastAsia="en-US"/>
+        </w:rPr>
+      </w:pPr>
+      <w:r>
+        <w:rPr>
+          <w:rFonts w:ascii="Arial" w:eastAsia="MS Gothic" w:hAnsi="Arial" w:cs="Times New Roman (Headings CS)"/>
+          <w:b/>
+          <w:color w:val="auto"/>
+          <w:sz w:val="22"/>
+          <w:szCs w:val="28"/>
+          <w:lang w:eastAsia="en-US"/>
+        </w:rPr>
+        <w:fldChar w:fldCharType="begin"/>
+      </w:r>
+      <w:r>
+        <w:rPr>
+          <w:rFonts w:ascii="Arial" w:eastAsia="MS Gothic" w:hAnsi="Arial" w:cs="Times New Roman (Headings CS)"/>
+          <w:b/>
+          <w:color w:val="auto"/>
+          <w:sz w:val="22"/>
+          <w:szCs w:val="28"/>
+          <w:lang w:eastAsia="en-US"/>
+        </w:rPr>
+        <w:instrText>HYPERLINK "https://github.com/amjad-jaloum/Ebda3Soft_AccountingSystem"</w:instrText>
+      </w:r>
+      <w:r>
+        <w:rPr>
+          <w:rFonts w:ascii="Arial" w:eastAsia="MS Gothic" w:hAnsi="Arial" w:cs="Times New Roman (Headings CS)"/>
+          <w:b/>
+          <w:color w:val="auto"/>
+          <w:sz w:val="22"/>
+          <w:szCs w:val="28"/>
+          <w:lang w:eastAsia="en-US"/>
+        </w:rPr>
+      </w:r>
+      <w:r>
+        <w:rPr>
+          <w:rFonts w:ascii="Arial" w:eastAsia="MS Gothic" w:hAnsi="Arial" w:cs="Times New Roman (Headings CS)"/>
+          <w:b/>
+          <w:color w:val="auto"/>
+          <w:sz w:val="22"/>
+          <w:szCs w:val="28"/>
+          <w:lang w:eastAsia="en-US"/>
+        </w:rPr>
+        <w:fldChar w:fldCharType="separate"/>
+      </w:r>
+      <w:r>
+        <w:rPr>
+          <w:rStyle w:val="Hyperlink"/>
+          <w:rFonts w:ascii="Arial" w:eastAsia="MS Gothic" w:hAnsi="Arial" w:cs="Times New Roman (Headings CS)"/>
+          <w:b/>
+          <w:color w:val="auto"/>
+          <w:sz w:val="22"/>
+          <w:szCs w:val="28"/>
+          <w:lang w:eastAsia="en-US"/>
+        </w:rPr>
+        <w:t>Ebda3Soft Accounting &amp; Inventory System</w:t>
+      </w:r>
+      <w:r>
+        <w:rPr>
+          <w:rStyle w:val="Hyperlink"/>
+          <w:rFonts w:ascii="Arial" w:eastAsia="MS Gothic" w:hAnsi="Arial" w:cs="Times New Roman (Headings CS)"/>
+          <w:b/>
+          <w:color w:val="auto"/>
+          <w:sz w:val="22"/>
+          <w:szCs w:val="28"/>
+          <w:u w:val="none"/>
+          <w:lang w:eastAsia="en-US"/>
+        </w:rPr>
+        <w:t xml:space="preserve"> </w:t>
+      </w:r>
+      <w:r>
+        <w:rPr>
+          <w:rStyle w:val="Hyperlink"/>
+          <w:rFonts w:ascii="Arial" w:eastAsia="Times New Roman" w:hAnsi="Arial" w:cs="Times New Roman (Headings CS)"/>
+          <w:b/>
+          <w:bCs/>
+          <w:color w:val="auto"/>
+          <w:sz w:val="22"/>
+          <w:szCs w:val="28"/>
+          <w:u w:val="none"/>
+          <w:lang w:eastAsia="en-US"/>
+        </w:rPr>
+        <w:t>(</w:t>
+      </w:r>
+      <w:r>
+        <w:rPr>
+          <w:rStyle w:val="Hyperlink"/>
+          <w:rFonts w:ascii="Arial" w:eastAsia="MS Gothic" w:hAnsi="Arial" w:cs="Times New Roman (Headings CS)"/>
+          <w:b/>
+          <w:color w:val="auto"/>
+          <w:sz w:val="22"/>
+          <w:szCs w:val="28"/>
+          <w:u w:val="none"/>
+          <w:lang w:eastAsia="en-US"/>
+        </w:rPr>
+        <w:t>May 2026 – May 2026)</w:t>
+      </w:r>
+    </w:p>
+    <w:p>
+      <w:pPr>
+        <w:rPr>
+          <w:rFonts w:ascii="Arial" w:eastAsia="Arial" w:hAnsi="Arial" w:cs="Arial"/>
+          <w:color w:val="auto"/>
+          <w:sz w:val="22"/>
+          <w:szCs w:val="24"/>
+        </w:rPr>
+      </w:pPr>
+      <w:r>
+        <w:rPr>
+          <w:rFonts w:ascii="Arial" w:eastAsia="MS Gothic" w:hAnsi="Arial" w:cs="Times New Roman (Headings CS)"/>
+          <w:b/>
+          <w:color w:val="auto"/>
+          <w:sz w:val="22"/>
+          <w:szCs w:val="28"/>
+          <w:lang w:eastAsia="en-US"/>
+        </w:rPr>
+        <w:fldChar w:fldCharType="end"/>
+      </w:r>
+      <w:r>
+        <w:rPr>
+          <w:rFonts w:ascii="Arial" w:eastAsia="Arial" w:hAnsi="Arial" w:cs="Arial"/>
+          <w:color w:val="auto"/>
+          <w:sz w:val="22"/>
+          <w:szCs w:val="24"/>
+        </w:rPr>
+        <w:t>A modular accounting and inventory management system built with C# and SQL Server to streamline financial tracking and stock control.</w:t>
+      </w:r>
+    </w:p>
+    <w:p>
+      <w:pPr>
+        <w:spacing w:after="80" w:line="276" w:lineRule="auto"/>
+        <w:ind w:left="450" w:hanging="360"/>
         <w:jc w:val="both"/>
+        <w:rPr>
+          <w:rFonts w:ascii="Arial" w:eastAsia="Arial" w:hAnsi="Arial" w:cs="Arial"/>
+          <w:color w:val="auto"/>
+          <w:sz w:val="22"/>
+          <w:szCs w:val="24"/>
+        </w:rPr>
+      </w:pPr>
+      <w:r>
+        <w:rPr>
+          <w:rFonts w:ascii="Segoe UI" w:eastAsia="MS Gothic" w:hAnsi="Segoe UI" w:cs="Segoe UI"/>
+          <w:b/>
+          <w:bCs/>
+          <w:color w:val="auto"/>
+          <w:sz w:val="22"/>
+          <w:szCs w:val="28"/>
+        </w:rPr>
+        <w:t>Tech</w:t>
+      </w:r>
+      <w:r>
+        <w:rPr>
+          <w:rFonts w:ascii="Segoe UI" w:eastAsia="MS Gothic" w:hAnsi="Segoe UI" w:cs="Segoe UI"/>
+          <w:color w:val="auto"/>
+          <w:sz w:val="22"/>
+          <w:szCs w:val="28"/>
+        </w:rPr>
+        <w:t xml:space="preserve">: </w:t>
+      </w:r>
+      <w:r>
+        <w:rPr>
+          <w:rFonts w:ascii="Arial" w:eastAsia="Arial" w:hAnsi="Arial" w:cs="Arial"/>
+          <w:color w:val="auto"/>
+          <w:sz w:val="22"/>
+          <w:szCs w:val="24"/>
+        </w:rPr>
+        <w:t>C#, WinForms, SQL Server, ADO.NET.</w:t>
+      </w:r>
+    </w:p>
+    <w:p>
+      <w:pPr>
+        <w:spacing w:after="80" w:line="276" w:lineRule="auto"/>
+        <w:ind w:left="114" w:hanging="24"/>
+        <w:jc w:val="both"/>
+        <w:rPr>
+          <w:rFonts w:ascii="Arial" w:eastAsia="Arial" w:hAnsi="Arial" w:cs="Arial"/>
+          <w:color w:val="auto"/>
+          <w:sz w:val="22"/>
+          <w:szCs w:val="24"/>
+          <w:lang w:bidi="ar-YE"/>
+        </w:rPr>
+      </w:pPr>
+      <w:r>
+        <w:rPr>
+          <w:rFonts w:ascii="Arial" w:eastAsia="Arial" w:hAnsi="Arial" w:cs="Arial"/>
+          <w:color w:val="auto"/>
+          <w:sz w:val="22"/>
+          <w:szCs w:val="24"/>
+        </w:rPr>
+        <w:t>Architected a comprehensive accounting and inventory management system using C# and SQL Server. Engineered core financial modules, including Vouchers, Sales/Purchase Invoices, and automated stock reporting. Implemented robust logic for financial statements and account balance generation, ensuring precise data accuracy and streamlined real-world accounting workflows.</w:t>
+      </w:r>
+    </w:p>
+    <w:p>
+      <w:pPr>
+        <w:keepNext/>
+        <w:keepLines/>
+        <w:tabs>
+          <w:tab w:val="right" w:pos="9360"/>
+        </w:tabs>
+        <w:spacing w:before="180" w:after="0"/>
         <w:outlineLvl w:val="1"/>
         <w:rPr>
-          <w:rFonts w:ascii="Arial" w:eastAsia="Times New Roman" w:hAnsi="Arial" w:cs="Times New Roman (Headings CS)"/>
-          <w:b/>
-          <w:bCs/>
+          <w:rFonts w:ascii="Arial" w:eastAsia="MS Gothic" w:hAnsi="Arial" w:cs="Times New Roman (Headings CS)"/>
+          <w:b/>
           <w:color w:val="auto"/>
           <w:sz w:val="22"/>
           <w:szCs w:val="28"/>
@@ -1872,7 +1995,18 @@
         </w:rPr>
       </w:pPr>
       <w:hyperlink r:id="rId9" w:history="1">
-        <w:proofErr w:type="spellStart"/>
+        <w:r>
+          <w:rPr>
+            <w:rFonts w:ascii="Arial" w:eastAsia="MS Gothic" w:hAnsi="Arial" w:cs="Times New Roman (Headings CS)"/>
+            <w:b/>
+            <w:color w:val="auto"/>
+            <w:sz w:val="22"/>
+            <w:szCs w:val="28"/>
+            <w:u w:val="single"/>
+            <w:lang w:eastAsia="en-US"/>
+          </w:rPr>
+          <w:t>YemenIN</w:t>
+        </w:r>
         <w:r>
           <w:rPr>
             <w:rFonts w:ascii="Arial" w:eastAsia="MS Gothic" w:hAnsi="Arial" w:cs="Times New Roman (Headings CS)"/>
@@ -1882,9 +2016,8 @@
             <w:szCs w:val="28"/>
             <w:lang w:eastAsia="en-US"/>
           </w:rPr>
-          <w:t>CareerAI</w:t>
+          <w:t xml:space="preserve"> </w:t>
         </w:r>
-        <w:proofErr w:type="spellEnd"/>
       </w:hyperlink>
       <w:r>
         <w:rPr>
@@ -1896,172 +2029,70 @@
           <w:szCs w:val="28"/>
           <w:lang w:eastAsia="en-US"/>
         </w:rPr>
-        <w:t xml:space="preserve"> </w:t>
-      </w:r>
-      <w:r>
-        <w:rPr>
-          <w:rFonts w:ascii="Arial" w:eastAsia="Times New Roman" w:hAnsi="Arial" w:cs="Times New Roman (Headings CS)"/>
-          <w:b/>
-          <w:bCs/>
-          <w:color w:val="auto"/>
-          <w:sz w:val="22"/>
-          <w:szCs w:val="28"/>
-          <w:lang w:eastAsia="en-US"/>
-        </w:rPr>
         <w:t>(</w:t>
       </w:r>
       <w:r>
         <w:rPr>
-          <w:rFonts w:ascii="Arial" w:eastAsia="Times New Roman" w:hAnsi="Arial" w:cs="Times New Roman (Headings CS)"/>
-          <w:b/>
-          <w:bCs/>
-          <w:color w:val="auto"/>
-          <w:sz w:val="22"/>
-          <w:szCs w:val="28"/>
-          <w:lang w:eastAsia="en-US"/>
-        </w:rPr>
-        <w:t>Mar</w:t>
-      </w:r>
-      <w:r>
-        <w:rPr>
-          <w:rFonts w:ascii="Arial" w:eastAsia="Times New Roman" w:hAnsi="Arial" w:cs="Times New Roman (Headings CS)"/>
-          <w:b/>
-          <w:bCs/>
-          <w:color w:val="auto"/>
-          <w:sz w:val="22"/>
-          <w:szCs w:val="28"/>
-          <w:lang w:eastAsia="en-US"/>
-        </w:rPr>
-        <w:t xml:space="preserve"> </w:t>
-      </w:r>
-      <w:r>
-        <w:rPr>
-          <w:rFonts w:ascii="Arial" w:eastAsia="Times New Roman" w:hAnsi="Arial" w:cs="Times New Roman (Headings CS)"/>
-          <w:b/>
-          <w:bCs/>
-          <w:color w:val="auto"/>
-          <w:sz w:val="22"/>
-          <w:szCs w:val="28"/>
-          <w:lang w:eastAsia="en-US"/>
-        </w:rPr>
-        <w:t>2025</w:t>
-      </w:r>
-      <w:r>
-        <w:rPr>
-          <w:rFonts w:ascii="Arial" w:eastAsia="Times New Roman" w:hAnsi="Arial" w:cs="Times New Roman (Headings CS)"/>
-          <w:b/>
-          <w:bCs/>
-          <w:color w:val="auto"/>
-          <w:sz w:val="22"/>
-          <w:szCs w:val="28"/>
-          <w:lang w:eastAsia="en-US"/>
-        </w:rPr>
-        <w:t xml:space="preserve"> – </w:t>
-      </w:r>
-      <w:r>
-        <w:rPr>
-          <w:rFonts w:ascii="Arial" w:eastAsia="Times New Roman" w:hAnsi="Arial" w:cs="Times New Roman (Headings CS)"/>
-          <w:b/>
-          <w:bCs/>
-          <w:color w:val="auto"/>
-          <w:sz w:val="22"/>
-          <w:szCs w:val="28"/>
-          <w:lang w:eastAsia="en-US"/>
-        </w:rPr>
-        <w:t>Mar</w:t>
-      </w:r>
-      <w:r>
-        <w:rPr>
-          <w:rFonts w:ascii="Arial" w:eastAsia="Times New Roman" w:hAnsi="Arial" w:cs="Times New Roman (Headings CS)"/>
-          <w:b/>
-          <w:bCs/>
-          <w:color w:val="auto"/>
-          <w:sz w:val="22"/>
-          <w:szCs w:val="28"/>
-          <w:lang w:eastAsia="en-US"/>
-        </w:rPr>
-        <w:t xml:space="preserve"> 2025</w:t>
-      </w:r>
-      <w:r>
-        <w:rPr>
-          <w:rFonts w:ascii="Arial" w:eastAsia="Times New Roman" w:hAnsi="Arial" w:cs="Times New Roman (Headings CS)"/>
-          <w:b/>
-          <w:bCs/>
-          <w:color w:val="auto"/>
-          <w:sz w:val="22"/>
-          <w:szCs w:val="28"/>
-          <w:lang w:eastAsia="en-US"/>
-        </w:rPr>
-        <w:t>)</w:t>
-      </w:r>
-    </w:p>
-    <w:p>
-      <w:pPr>
-        <w:spacing w:after="80" w:line="276" w:lineRule="auto"/>
-        <w:ind w:left="142"/>
-        <w:jc w:val="both"/>
-        <w:rPr>
-          <w:rFonts w:ascii="Arial" w:eastAsia="Arial" w:hAnsi="Arial" w:cs="Arial"/>
-          <w:b/>
-          <w:bCs/>
-          <w:color w:val="000000"/>
-          <w:sz w:val="22"/>
-          <w:szCs w:val="24"/>
-        </w:rPr>
-      </w:pPr>
-      <w:r>
-        <w:rPr>
-          <w:rFonts w:ascii="Arial" w:eastAsia="Arial" w:hAnsi="Arial" w:cs="Arial"/>
-          <w:color w:val="000000"/>
-          <w:sz w:val="22"/>
-          <w:szCs w:val="24"/>
-        </w:rPr>
-        <w:t>A modern</w:t>
-      </w:r>
-      <w:r>
-        <w:rPr>
-          <w:rFonts w:ascii="Arial" w:eastAsia="Arial" w:hAnsi="Arial" w:cs="Arial"/>
-          <w:color w:val="000000"/>
-          <w:sz w:val="22"/>
-          <w:szCs w:val="24"/>
-        </w:rPr>
-        <w:t xml:space="preserve"> AI-powered career guidance</w:t>
-      </w:r>
-      <w:r>
-        <w:rPr>
-          <w:rFonts w:ascii="Arial" w:eastAsia="Arial" w:hAnsi="Arial" w:cs="Arial"/>
-          <w:color w:val="000000"/>
-          <w:sz w:val="22"/>
-          <w:szCs w:val="24"/>
-        </w:rPr>
-        <w:t xml:space="preserve"> web platform</w:t>
-      </w:r>
-      <w:r>
-        <w:rPr>
-          <w:rFonts w:ascii="Arial" w:eastAsia="Arial" w:hAnsi="Arial" w:cs="Arial"/>
-          <w:color w:val="000000"/>
-          <w:sz w:val="22"/>
-          <w:szCs w:val="24"/>
-        </w:rPr>
-        <w:t xml:space="preserve">, CV and job description analysis with </w:t>
-      </w:r>
-      <w:r>
-        <w:rPr>
-          <w:rFonts w:ascii="Arial" w:eastAsia="Arial" w:hAnsi="Arial" w:cs="Arial"/>
-          <w:color w:val="000000"/>
-          <w:sz w:val="22"/>
-          <w:szCs w:val="24"/>
-        </w:rPr>
-        <w:t>interactive Q&amp;A modules to improve candidate readiness</w:t>
-      </w:r>
-      <w:r>
-        <w:rPr>
-          <w:rFonts w:ascii="Arial" w:eastAsia="Arial" w:hAnsi="Arial" w:cs="Arial"/>
-          <w:color w:val="000000"/>
-          <w:sz w:val="22"/>
-          <w:szCs w:val="24"/>
-        </w:rPr>
-        <w:t xml:space="preserve">. </w:t>
+          <w:rFonts w:ascii="Arial" w:eastAsia="MS Gothic" w:hAnsi="Arial" w:cs="Times New Roman (Headings CS)"/>
+          <w:b/>
+          <w:color w:val="auto"/>
+          <w:sz w:val="22"/>
+          <w:szCs w:val="28"/>
+          <w:lang w:eastAsia="en-US"/>
+        </w:rPr>
+        <w:t>Oct</w:t>
+      </w:r>
+      <w:r>
+        <w:rPr>
+          <w:rFonts w:ascii="Arial" w:eastAsia="MS Gothic" w:hAnsi="Arial" w:cs="Times New Roman (Headings CS)"/>
+          <w:b/>
+          <w:color w:val="auto"/>
+          <w:sz w:val="22"/>
+          <w:szCs w:val="28"/>
+          <w:lang w:eastAsia="en-US"/>
+        </w:rPr>
+        <w:t xml:space="preserve"> 2024 – </w:t>
+      </w:r>
+      <w:r>
+        <w:rPr>
+          <w:rFonts w:ascii="Arial" w:eastAsia="MS Gothic" w:hAnsi="Arial" w:cs="Times New Roman (Headings CS)"/>
+          <w:b/>
+          <w:color w:val="auto"/>
+          <w:sz w:val="22"/>
+          <w:szCs w:val="28"/>
+          <w:lang w:eastAsia="en-US"/>
+        </w:rPr>
+        <w:t>Sep</w:t>
+      </w:r>
+      <w:r>
+        <w:rPr>
+          <w:rFonts w:ascii="Arial" w:eastAsia="MS Gothic" w:hAnsi="Arial" w:cs="Times New Roman (Headings CS)"/>
+          <w:b/>
+          <w:color w:val="auto"/>
+          <w:sz w:val="22"/>
+          <w:szCs w:val="28"/>
+          <w:lang w:eastAsia="en-US"/>
+        </w:rPr>
+        <w:t xml:space="preserve"> 2025)</w:t>
+      </w:r>
+    </w:p>
+    <w:p>
+      <w:pPr>
+        <w:rPr>
+          <w:rFonts w:ascii="Arial" w:eastAsia="Arial" w:hAnsi="Arial" w:cs="Arial"/>
+          <w:color w:val="000000"/>
+          <w:sz w:val="22"/>
+          <w:szCs w:val="24"/>
+        </w:rPr>
+      </w:pPr>
+      <w:r>
+        <w:rPr>
+          <w:rFonts w:ascii="Arial" w:eastAsia="Arial" w:hAnsi="Arial" w:cs="Arial"/>
+          <w:color w:val="000000"/>
+          <w:sz w:val="22"/>
+          <w:szCs w:val="24"/>
+        </w:rPr>
+        <w:t>A modern web platform that combines social media networking with AI-powered career guidance, designed as a beta simulation similar to LinkedIn.</w:t>
       </w:r>
     </w:p>
     <w:p>
@@ -2078,142 +2109,154 @@
       </w:pPr>
       <w:r>
         <w:rPr>
-          <w:rFonts w:ascii="Arial" w:eastAsia="Arial" w:hAnsi="Arial" w:cs="Arial"/>
+          <w:rFonts w:ascii="Segoe UI" w:eastAsia="MS Gothic" w:hAnsi="Segoe UI" w:cs="Segoe UI"/>
           <w:b/>
           <w:bCs/>
-          <w:color w:val="000000"/>
-          <w:sz w:val="22"/>
-          <w:szCs w:val="24"/>
+          <w:color w:val="191919"/>
+          <w:sz w:val="22"/>
+          <w:szCs w:val="28"/>
         </w:rPr>
         <w:t>Tech</w:t>
       </w:r>
       <w:r>
         <w:rPr>
-          <w:rFonts w:ascii="Arial" w:eastAsia="Arial" w:hAnsi="Arial" w:cs="Arial"/>
-          <w:color w:val="000000"/>
-          <w:sz w:val="22"/>
-          <w:szCs w:val="24"/>
-        </w:rPr>
-        <w:t>: Laravel, Livewire, Alpine.js, MySQL</w:t>
+          <w:rFonts w:ascii="Segoe UI" w:eastAsia="MS Gothic" w:hAnsi="Segoe UI" w:cs="Segoe UI"/>
+          <w:color w:val="191919"/>
+          <w:sz w:val="22"/>
+          <w:szCs w:val="28"/>
+        </w:rPr>
+        <w:t xml:space="preserve">: </w:t>
+      </w:r>
+      <w:r>
+        <w:rPr>
+          <w:rFonts w:ascii="Arial" w:eastAsia="Arial" w:hAnsi="Arial" w:cs="Arial"/>
+          <w:color w:val="000000"/>
+          <w:sz w:val="22"/>
+          <w:szCs w:val="24"/>
+        </w:rPr>
+        <w:t>Livewire, Laravel, Alpine.js, Bootstrap and MySQL.</w:t>
       </w:r>
     </w:p>
     <w:p>
       <w:pPr>
         <w:spacing w:after="80" w:line="276" w:lineRule="auto"/>
-        <w:ind w:left="142"/>
+        <w:ind w:left="114" w:hanging="24"/>
         <w:jc w:val="both"/>
         <w:rPr>
           <w:rFonts w:ascii="Arial" w:eastAsia="Arial" w:hAnsi="Arial" w:cs="Arial"/>
           <w:color w:val="000000"/>
           <w:sz w:val="22"/>
           <w:szCs w:val="24"/>
-        </w:rPr>
-      </w:pPr>
-      <w:r>
-        <w:rPr>
-          <w:rFonts w:ascii="Arial" w:eastAsia="Arial" w:hAnsi="Arial" w:cs="Arial"/>
-          <w:color w:val="000000"/>
-          <w:sz w:val="22"/>
-          <w:szCs w:val="24"/>
-        </w:rPr>
-        <w:t xml:space="preserve">As a </w:t>
-      </w:r>
-      <w:r>
-        <w:rPr>
-          <w:rFonts w:ascii="Arial" w:eastAsia="Times New Roman" w:hAnsi="Arial" w:cs="Times New Roman (Headings CS)"/>
-          <w:color w:val="auto"/>
-          <w:sz w:val="22"/>
-          <w:szCs w:val="28"/>
-          <w:lang w:eastAsia="en-US"/>
-        </w:rPr>
-        <w:t>7</w:t>
-      </w:r>
-      <w:r>
-        <w:rPr>
-          <w:rFonts w:ascii="Cambria Math" w:eastAsia="Times New Roman" w:hAnsi="Cambria Math" w:cs="Cambria Math"/>
-          <w:color w:val="auto"/>
-          <w:sz w:val="22"/>
-          <w:szCs w:val="28"/>
-          <w:lang w:eastAsia="en-US"/>
+          <w:lang w:bidi="ar-YE"/>
+        </w:rPr>
+      </w:pPr>
+      <w:r>
+        <w:rPr>
+          <w:rFonts w:ascii="Arial" w:eastAsia="Arial" w:hAnsi="Arial" w:cs="Arial"/>
+          <w:color w:val="000000"/>
+          <w:sz w:val="22"/>
+          <w:szCs w:val="24"/>
+        </w:rPr>
+        <w:t>As a team project I participated in developing</w:t>
+      </w:r>
+      <w:r>
+        <w:rPr>
+          <w:rFonts w:ascii="Arial" w:eastAsia="Arial" w:hAnsi="Arial" w:cs="Arial"/>
+          <w:color w:val="000000"/>
+          <w:sz w:val="22"/>
+          <w:szCs w:val="24"/>
+        </w:rPr>
+        <w:t xml:space="preserve"> the Laravel/MySQL </w:t>
+      </w:r>
+      <w:r>
+        <w:rPr>
+          <w:rFonts w:ascii="Arial" w:eastAsia="Arial" w:hAnsi="Arial" w:cs="Arial"/>
+          <w:color w:val="000000"/>
+          <w:sz w:val="22"/>
+          <w:szCs w:val="24"/>
+        </w:rPr>
+        <w:t>tables schema</w:t>
+      </w:r>
+      <w:r>
+        <w:rPr>
+          <w:rFonts w:ascii="Arial" w:eastAsia="Arial" w:hAnsi="Arial" w:cs="Arial"/>
+          <w:color w:val="000000"/>
+          <w:sz w:val="22"/>
+          <w:szCs w:val="24"/>
+        </w:rPr>
+        <w:t xml:space="preserve"> and data model for posts, jobs, and </w:t>
+      </w:r>
+      <w:r>
+        <w:rPr>
+          <w:rFonts w:ascii="Arial" w:eastAsia="Arial" w:hAnsi="Arial" w:cs="Arial"/>
+          <w:color w:val="000000"/>
+          <w:sz w:val="22"/>
+          <w:szCs w:val="24"/>
+        </w:rPr>
+        <w:t>etc.</w:t>
+      </w:r>
+      <w:r>
+        <w:rPr>
+          <w:rFonts w:ascii="Arial" w:eastAsia="Arial" w:hAnsi="Arial" w:cs="Arial"/>
+          <w:color w:val="000000"/>
+          <w:sz w:val="22"/>
+          <w:szCs w:val="24"/>
+        </w:rPr>
+        <w:t xml:space="preserve"> </w:t>
+      </w:r>
+      <w:r>
+        <w:rPr>
+          <w:rFonts w:ascii="Arial" w:eastAsia="Arial" w:hAnsi="Arial" w:cs="Arial"/>
+          <w:color w:val="000000"/>
+          <w:sz w:val="22"/>
+          <w:szCs w:val="24"/>
+        </w:rPr>
+        <w:t>O</w:t>
+      </w:r>
+      <w:r>
+        <w:rPr>
+          <w:rFonts w:ascii="Arial" w:eastAsia="Arial" w:hAnsi="Arial" w:cs="Arial"/>
+          <w:color w:val="000000"/>
+          <w:sz w:val="22"/>
+          <w:szCs w:val="24"/>
+        </w:rPr>
+        <w:t>ptimized key queries and added indexes to reduce page load times noticeably.</w:t>
+      </w:r>
+      <w:r>
+        <w:rPr>
+          <w:rFonts w:ascii="Arial" w:eastAsia="Arial" w:hAnsi="Arial" w:cs="Arial"/>
+          <w:color w:val="000000"/>
+          <w:sz w:val="22"/>
+          <w:szCs w:val="24"/>
+        </w:rPr>
+        <w:t xml:space="preserve"> I also i</w:t>
+      </w:r>
+      <w:r>
+        <w:rPr>
+          <w:rFonts w:ascii="Arial" w:eastAsia="Arial" w:hAnsi="Arial" w:cs="Arial"/>
+          <w:color w:val="000000"/>
+          <w:sz w:val="22"/>
+          <w:szCs w:val="24"/>
+        </w:rPr>
+        <w:t>mplemented real</w:t>
+      </w:r>
+      <w:r>
+        <w:rPr>
+          <w:rFonts w:ascii="Cambria Math" w:eastAsia="Arial" w:hAnsi="Cambria Math" w:cs="Cambria Math"/>
+          <w:color w:val="000000"/>
+          <w:sz w:val="22"/>
+          <w:szCs w:val="24"/>
         </w:rPr>
         <w:t>‑</w:t>
       </w:r>
       <w:r>
         <w:rPr>
-          <w:rFonts w:ascii="Arial" w:eastAsia="Times New Roman" w:hAnsi="Arial" w:cs="Times New Roman (Headings CS)"/>
-          <w:color w:val="auto"/>
-          <w:sz w:val="22"/>
-          <w:szCs w:val="28"/>
-          <w:lang w:eastAsia="en-US"/>
-        </w:rPr>
-        <w:t>days Hackathon project</w:t>
-      </w:r>
-      <w:r>
-        <w:rPr>
-          <w:rFonts w:ascii="Arial" w:eastAsia="Arial" w:hAnsi="Arial" w:cs="Arial"/>
-          <w:color w:val="000000"/>
-          <w:sz w:val="22"/>
-          <w:szCs w:val="24"/>
-        </w:rPr>
-        <w:t xml:space="preserve"> I</w:t>
-      </w:r>
-      <w:r>
-        <w:rPr>
-          <w:rFonts w:ascii="Arial" w:eastAsia="Arial" w:hAnsi="Arial" w:cs="Arial"/>
-          <w:color w:val="000000"/>
-          <w:sz w:val="22"/>
-          <w:szCs w:val="24"/>
-        </w:rPr>
-        <w:t xml:space="preserve"> </w:t>
-      </w:r>
-      <w:r>
-        <w:rPr>
-          <w:rFonts w:ascii="Arial" w:eastAsia="Arial" w:hAnsi="Arial" w:cs="Arial"/>
-          <w:color w:val="000000"/>
-          <w:sz w:val="22"/>
-          <w:szCs w:val="24"/>
-        </w:rPr>
-        <w:t>Implemented</w:t>
-      </w:r>
-      <w:r>
-        <w:rPr>
-          <w:rFonts w:ascii="Arial" w:eastAsia="Arial" w:hAnsi="Arial" w:cs="Arial"/>
-          <w:b/>
-          <w:bCs/>
-          <w:color w:val="000000"/>
-          <w:sz w:val="22"/>
-          <w:szCs w:val="24"/>
-        </w:rPr>
-        <w:t xml:space="preserve"> </w:t>
-      </w:r>
-      <w:r>
-        <w:rPr>
-          <w:rFonts w:ascii="Arial" w:eastAsia="Arial" w:hAnsi="Arial" w:cs="Arial"/>
-          <w:color w:val="000000"/>
-          <w:sz w:val="22"/>
-          <w:szCs w:val="24"/>
-        </w:rPr>
-        <w:t xml:space="preserve">Backend systems + dynamic UI components. </w:t>
-      </w:r>
-      <w:r>
-        <w:rPr>
-          <w:rFonts w:ascii="Arial" w:eastAsia="Arial" w:hAnsi="Arial" w:cs="Arial"/>
-          <w:b/>
-          <w:bCs/>
-          <w:color w:val="000000"/>
-          <w:sz w:val="22"/>
-          <w:szCs w:val="24"/>
-        </w:rPr>
-        <w:t>Competed in Slam Hack 2025</w:t>
-      </w:r>
-      <w:r>
-        <w:rPr>
-          <w:rFonts w:ascii="Arial" w:eastAsia="Arial" w:hAnsi="Arial" w:cs="Arial"/>
-          <w:color w:val="000000"/>
-          <w:sz w:val="22"/>
-          <w:szCs w:val="24"/>
-        </w:rPr>
-        <w:t xml:space="preserve">, delivering a functional prototype in 7 days.  </w:t>
+          <w:rFonts w:ascii="Arial" w:eastAsia="Arial" w:hAnsi="Arial" w:cs="Arial"/>
+          <w:color w:val="000000"/>
+          <w:sz w:val="22"/>
+          <w:szCs w:val="24"/>
+        </w:rPr>
+        <w:t>time UI updates with Livewire + Alpine.js to enable instant post/comment reactions and live chat. Led integration of job postings into the main feed to increase discoverability and reduce navigation friction.</w:t>
       </w:r>
     </w:p>
     <w:p>
@@ -2335,7 +2378,7 @@
       <w:pPr>
         <w:numPr>
           <w:ilvl w:val="0"/>
-          <w:numId w:val="4"/>
+          <w:numId w:val="8"/>
         </w:numPr>
         <w:shd w:val="clear" w:color="auto" w:fill="FFFFFF"/>
         <w:spacing w:after="60"/>
@@ -2359,7 +2402,7 @@
           <w:sz w:val="22"/>
           <w:szCs w:val="24"/>
         </w:rPr>
-        <w:t>C# &amp; Database Connectivity (Dec 2025):</w:t>
+        <w:t>Full Real Project - DVLD (May 2026):</w:t>
       </w:r>
     </w:p>
     <w:p>
@@ -2382,17 +2425,7 @@
           <w:sz w:val="22"/>
           <w:lang w:eastAsia="en-US"/>
         </w:rPr>
-        <w:t>Implemented database connectivity in C# using ADO.NET and applied 3</w:t>
-      </w:r>
-      <w:r>
-        <w:rPr>
-          <w:rFonts w:ascii="Segoe UI" w:eastAsia="Times New Roman" w:hAnsi="Segoe UI" w:cs="Segoe UI"/>
-          <w:color w:val="auto"/>
-          <w:sz w:val="22"/>
-          <w:lang w:eastAsia="en-US"/>
-        </w:rPr>
-        <w:noBreakHyphen/>
-        <w:t>Tier Architecture for scalable solutions.</w:t>
+        <w:t>Implemented an end-to-end desktop management system for the Driver and Vehicle Licensing Directorate (DVLD). Applied 3-Tier Architecture and ADO.NET for secure database connectivity, developed multi-stage testing workflows, and enforced complex business rules to ensure data integrity and scalable performance.</w:t>
       </w:r>
     </w:p>
     <w:p>
@@ -2423,7 +2456,7 @@
           <w:sz w:val="22"/>
           <w:szCs w:val="24"/>
         </w:rPr>
-        <w:t>SQL (Projects &amp; Practice) - Level 1 (Oct 2025):</w:t>
+        <w:t>C# &amp; Database Connectivity (Dec 2025):</w:t>
       </w:r>
     </w:p>
     <w:p>
@@ -2446,7 +2479,17 @@
           <w:sz w:val="22"/>
           <w:lang w:eastAsia="en-US"/>
         </w:rPr>
-        <w:t>Completed a SQL course focused on real-world database scenarios, including query optimization, multi-table joins, and practical data manipulation.</w:t>
+        <w:t>Implemented database connectivity in C# using ADO.NET and applied 3</w:t>
+      </w:r>
+      <w:r>
+        <w:rPr>
+          <w:rFonts w:ascii="Segoe UI" w:eastAsia="Times New Roman" w:hAnsi="Segoe UI" w:cs="Segoe UI"/>
+          <w:color w:val="auto"/>
+          <w:sz w:val="22"/>
+          <w:lang w:eastAsia="en-US"/>
+        </w:rPr>
+        <w:noBreakHyphen/>
+        <w:t>Tier Architecture for scalable solutions.</w:t>
       </w:r>
     </w:p>
     <w:p>
@@ -2477,7 +2520,7 @@
           <w:sz w:val="22"/>
           <w:szCs w:val="24"/>
         </w:rPr>
-        <w:t>OOP As It Should Be in C# (Sep 2025):</w:t>
+        <w:t>SQL (Projects &amp; Practice) - Level 1 (Oct 2025):</w:t>
       </w:r>
     </w:p>
     <w:p>
@@ -2487,23 +2530,21 @@
         <w:ind w:left="360"/>
         <w:jc w:val="both"/>
         <w:rPr>
-          <w:rFonts w:ascii="Times New Roman" w:eastAsia="Arial" w:hAnsi="Times New Roman" w:cs="Times New Roman"/>
-          <w:b/>
-          <w:bCs/>
-          <w:color w:val="auto"/>
-          <w:sz w:val="22"/>
-          <w:szCs w:val="24"/>
-          <w:lang w:eastAsia="en-US"/>
-        </w:rPr>
-      </w:pPr>
-      <w:r>
-        <w:rPr>
           <w:rFonts w:ascii="Segoe UI" w:eastAsia="Times New Roman" w:hAnsi="Segoe UI" w:cs="Segoe UI"/>
           <w:color w:val="auto"/>
           <w:sz w:val="22"/>
           <w:lang w:eastAsia="en-US"/>
         </w:rPr>
-        <w:t>Explored object-oriented programming principles through a modern C# lens, focusing on clean architecture, encapsulation, inheritance, and polymorphism. Gained practical experience in building maintainable and scalable applications using best practices in OOP design.</w:t>
+      </w:pPr>
+      <w:r>
+        <w:rPr>
+          <w:rFonts w:ascii="Segoe UI" w:eastAsia="Times New Roman" w:hAnsi="Segoe UI" w:cs="Segoe UI"/>
+          <w:color w:val="auto"/>
+          <w:sz w:val="22"/>
+          <w:lang w:eastAsia="en-US"/>
+        </w:rPr>
+        <w:lastRenderedPageBreak/>
+        <w:t>Completed a SQL course focused on real-world database scenarios, including query optimization, multi-table joins, and practical data manipulation.</w:t>
       </w:r>
     </w:p>
     <w:p>
@@ -2534,7 +2575,7 @@
           <w:sz w:val="22"/>
           <w:szCs w:val="24"/>
         </w:rPr>
-        <w:t>SQL &amp; Databases - Level 1 (Aug 2025):</w:t>
+        <w:t>OOP As It Should Be in C# (Sep 2025):</w:t>
       </w:r>
     </w:p>
     <w:p>
@@ -2544,20 +2585,23 @@
         <w:ind w:left="360"/>
         <w:jc w:val="both"/>
         <w:rPr>
+          <w:rFonts w:ascii="Times New Roman" w:eastAsia="Arial" w:hAnsi="Times New Roman" w:cs="Times New Roman"/>
+          <w:b/>
+          <w:bCs/>
+          <w:color w:val="auto"/>
+          <w:sz w:val="22"/>
+          <w:szCs w:val="24"/>
+          <w:lang w:eastAsia="en-US"/>
+        </w:rPr>
+      </w:pPr>
+      <w:r>
+        <w:rPr>
           <w:rFonts w:ascii="Segoe UI" w:eastAsia="Times New Roman" w:hAnsi="Segoe UI" w:cs="Segoe UI"/>
           <w:color w:val="auto"/>
           <w:sz w:val="22"/>
           <w:lang w:eastAsia="en-US"/>
         </w:rPr>
-      </w:pPr>
-      <w:r>
-        <w:rPr>
-          <w:rFonts w:ascii="Segoe UI" w:eastAsia="Times New Roman" w:hAnsi="Segoe UI" w:cs="Segoe UI"/>
-          <w:color w:val="auto"/>
-          <w:sz w:val="22"/>
-          <w:lang w:eastAsia="en-US"/>
-        </w:rPr>
-        <w:t>Mastered fundamental database concepts and SQL syntax, gained proficiency in writing complex queries for data retrieval and manipulation, and developed skills in database design and management as a core foundation for data-driven application development.</w:t>
+        <w:t>Explored object-oriented programming principles through a modern C# lens, focusing on clean architecture, encapsulation, inheritance, and polymorphism. Gained practical experience in building maintainable and scalable applications using best practices in OOP design.</w:t>
       </w:r>
     </w:p>
     <w:p>
@@ -2588,7 +2632,7 @@
           <w:sz w:val="22"/>
           <w:szCs w:val="24"/>
         </w:rPr>
-        <w:t>C# - Level 1 (Jul 2025):</w:t>
+        <w:t>SQL &amp; Databases - Level 1 (Aug 2025):</w:t>
       </w:r>
     </w:p>
     <w:p>
@@ -2611,31 +2655,7 @@
           <w:sz w:val="22"/>
           <w:lang w:eastAsia="en-US"/>
         </w:rPr>
-        <w:t>Learned C# programming rules and professional basics, gained desktop app development skills using Windows Forms, and explored advanced programming concepts as a foundation for comprehensive technical solutions (for Web, Mobile, etc.).</w:t>
-      </w:r>
-    </w:p>
-    <w:p>
-      <w:pPr>
-        <w:spacing w:after="160" w:line="259" w:lineRule="auto"/>
-        <w:rPr>
-          <w:rFonts w:ascii="Arial" w:eastAsia="Arial" w:hAnsi="Arial" w:cs="Arial"/>
-          <w:b/>
-          <w:bCs/>
-          <w:color w:val="000000"/>
-          <w:sz w:val="22"/>
-          <w:szCs w:val="24"/>
-        </w:rPr>
-      </w:pPr>
-      <w:r>
-        <w:rPr>
-          <w:rFonts w:ascii="Arial" w:eastAsia="Arial" w:hAnsi="Arial" w:cs="Arial"/>
-          <w:b/>
-          <w:bCs/>
-          <w:color w:val="000000"/>
-          <w:sz w:val="22"/>
-          <w:szCs w:val="24"/>
-        </w:rPr>
-        <w:br w:type="page"/>
+        <w:t>Mastered fundamental database concepts and SQL syntax, gained proficiency in writing complex queries for data retrieval and manipulation, and developed skills in database design and management as a core foundation for data-driven application development.</w:t>
       </w:r>
     </w:p>
     <w:p>
@@ -2666,7 +2686,60 @@
           <w:sz w:val="22"/>
           <w:szCs w:val="24"/>
         </w:rPr>
-        <w:lastRenderedPageBreak/>
+        <w:t>C# - Level 1 (Jul 2025):</w:t>
+      </w:r>
+    </w:p>
+    <w:p>
+      <w:pPr>
+        <w:shd w:val="clear" w:color="auto" w:fill="FFFFFF"/>
+        <w:spacing w:after="0"/>
+        <w:ind w:left="360"/>
+        <w:jc w:val="both"/>
+        <w:rPr>
+          <w:rFonts w:ascii="Segoe UI" w:eastAsia="Times New Roman" w:hAnsi="Segoe UI" w:cs="Segoe UI"/>
+          <w:color w:val="auto"/>
+          <w:sz w:val="22"/>
+          <w:lang w:eastAsia="en-US"/>
+        </w:rPr>
+      </w:pPr>
+      <w:r>
+        <w:rPr>
+          <w:rFonts w:ascii="Segoe UI" w:eastAsia="Times New Roman" w:hAnsi="Segoe UI" w:cs="Segoe UI"/>
+          <w:color w:val="auto"/>
+          <w:sz w:val="22"/>
+          <w:lang w:eastAsia="en-US"/>
+        </w:rPr>
+        <w:t>Learned C# programming rules and professional basics, gained desktop app development skills using Windows Forms, and explored advanced programming concepts as a foundation for comprehensive technical solutions (for Web, Mobile, etc.).</w:t>
+      </w:r>
+    </w:p>
+    <w:p>
+      <w:pPr>
+        <w:numPr>
+          <w:ilvl w:val="0"/>
+          <w:numId w:val="4"/>
+        </w:numPr>
+        <w:shd w:val="clear" w:color="auto" w:fill="FFFFFF"/>
+        <w:spacing w:after="60" w:line="429" w:lineRule="atLeast"/>
+        <w:ind w:left="360"/>
+        <w:jc w:val="both"/>
+        <w:rPr>
+          <w:rFonts w:ascii="Arial" w:eastAsia="Arial" w:hAnsi="Arial" w:cs="Arial"/>
+          <w:b/>
+          <w:bCs/>
+          <w:color w:val="000000"/>
+          <w:sz w:val="22"/>
+          <w:szCs w:val="24"/>
+        </w:rPr>
+      </w:pPr>
+      <w:r>
+        <w:rPr>
+          <w:rFonts w:ascii="Arial" w:eastAsia="Arial" w:hAnsi="Arial" w:cs="Arial"/>
+          <w:b/>
+          <w:bCs/>
+          <w:color w:val="000000"/>
+          <w:sz w:val="22"/>
+          <w:szCs w:val="24"/>
+        </w:rPr>
         <w:t>Algorithms &amp; Problem-Solving (Levels 2–5):</w:t>
       </w:r>
     </w:p>
@@ -3433,7 +3506,6 @@
       </w:r>
       <w:bookmarkEnd w:id="0"/>
     </w:p>
-    <w:p/>
     <w:sectPr>
       <w:pgSz w:w="12240" w:h="15840"/>
       <w:pgMar w:top="720" w:right="720" w:bottom="720" w:left="720" w:header="708" w:footer="708" w:gutter="0"/>
@@ -4330,6 +4402,18 @@
   </w:num>
   <w:num w:numId="7" w16cid:durableId="1871071789">
     <w:abstractNumId w:val="5"/>
+  </w:num>
+  <w:num w:numId="8" w16cid:durableId="970407533">
+    <w:abstractNumId w:val="4"/>
+    <w:lvlOverride w:ilvl="0"/>
+    <w:lvlOverride w:ilvl="1"/>
+    <w:lvlOverride w:ilvl="2"/>
+    <w:lvlOverride w:ilvl="3"/>
+    <w:lvlOverride w:ilvl="4"/>
+    <w:lvlOverride w:ilvl="5"/>
+    <w:lvlOverride w:ilvl="6"/>
+    <w:lvlOverride w:ilvl="7"/>
+    <w:lvlOverride w:ilvl="8"/>
   </w:num>
 </w:numbering>
 </file>
@@ -4951,6 +5035,18 @@
       <w:lang w:eastAsia="en-US"/>
     </w:rPr>
   </w:style>
+  <w:style w:type="character" w:styleId="UnresolvedMention">
+    <w:name w:val="Unresolved Mention"/>
+    <w:basedOn w:val="DefaultParagraphFont"/>
+    <w:uiPriority w:val="99"/>
+    <w:semiHidden/>
+    <w:unhideWhenUsed/>
+    <w:rsid w:val="001130D0"/>
+    <w:rPr>
+      <w:color w:val="605E5C"/>
+      <w:shd w:val="clear" w:color="auto" w:fill="E1DFDD"/>
+    </w:rPr>
+  </w:style>
 </w:styles>
 </file>
 

</xml_diff>

<commit_message>
Updare My Resume docx file
</commit_message>
<xml_diff>
--- a/MyResumes/Amgad-Galaom-Software-Engineer.docx
+++ b/MyResumes/Amgad-Galaom-Software-Engineer.docx
@@ -298,7 +298,6 @@
         <w:jc w:val="both"/>
         <w:rPr>
           <w:rFonts w:ascii="Segoe UI" w:eastAsia="Arial" w:hAnsi="Segoe UI" w:cs="Segoe UI"/>
-          <w:b/>
           <w:color w:val="000000"/>
           <w:sz w:val="22"/>
         </w:rPr>
@@ -309,7 +308,26 @@
           <w:color w:val="000000"/>
           <w:sz w:val="22"/>
         </w:rPr>
-        <w:t>Motivated and detail-oriented TALL-Stack and Desktop Developer with a Bachelor’s degree in Computer Science and proven experience as a Practical Labs Instructor. Skilled in full-stack web development using Tailwind, Alpine JS, Laravel, Livewire, and MySQL, with strong expertise in object-oriented programming and algorithmic problem-solving. Experienced in delivering hands-on labs in Python (Data Mining), C++ (Programming Fundamentals), and C# (Operating Systems), reinforcing core concepts such as supervised/unsupervised learning, debugging, concurrency, and kernel programming. Adept at designing technical workflows, mentoring students, and implementing scalable solutions across web and desktop environments. Committed to continuous learning, professional growth, and contributing technical skills to dynamic development teams and real-world projects.</w:t>
+        <w:t xml:space="preserve">Motivated and detail-oriented TALL-Stack and Desktop Developer with a Bachelor’s degree in Computer Science and proven experience as a Practical Labs Instructor. Skilled in full-stack web development using Tailwind, Alpine JS, Laravel, Livewire, and MySQL, with strong expertise in object-oriented programming and algorithmic problem-solving. </w:t>
+      </w:r>
+    </w:p>
+    <w:p>
+      <w:pPr>
+        <w:jc w:val="both"/>
+        <w:rPr>
+          <w:rFonts w:ascii="Segoe UI" w:eastAsia="Arial" w:hAnsi="Segoe UI" w:cs="Segoe UI"/>
+          <w:b/>
+          <w:color w:val="000000"/>
+          <w:sz w:val="22"/>
+        </w:rPr>
+      </w:pPr>
+      <w:r>
+        <w:rPr>
+          <w:rFonts w:ascii="Segoe UI" w:eastAsia="Arial" w:hAnsi="Segoe UI" w:cs="Segoe UI"/>
+          <w:color w:val="000000"/>
+          <w:sz w:val="22"/>
+        </w:rPr>
+        <w:t>Experienced in delivering hands-on labs in Python (Data Mining), C++ (Programming Fundamentals), and C# (Operating Systems), reinforcing core concepts such as supervised/unsupervised learning, debugging, concurrency, and kernel programming. Adept at designing technical workflows, mentoring students, and implementing scalable solutions across web and desktop environments. Committed to continuous learning, professional growth, and contributing technical skills to dynamic development teams and real-world projects.</w:t>
       </w:r>
     </w:p>
     <w:p>
@@ -1283,6 +1301,7 @@
           <w:bdr w:val="none" w:sz="0" w:space="0" w:color="auto" w:frame="1"/>
           <w:lang w:eastAsia="en-US"/>
         </w:rPr>
+        <w:lastRenderedPageBreak/>
         <w:t xml:space="preserve">Mentorship and feedback on debugging techniques  </w:t>
       </w:r>
     </w:p>
@@ -1339,7 +1358,6 @@
           <w:sz w:val="22"/>
           <w:szCs w:val="28"/>
         </w:rPr>
-        <w:lastRenderedPageBreak/>
         <w:t xml:space="preserve">Key projects supervised:  </w:t>
       </w:r>
     </w:p>
@@ -1539,7 +1557,6 @@
         </w:rPr>
       </w:pPr>
       <w:hyperlink r:id="rId8" w:history="1">
-        <w:proofErr w:type="spellStart"/>
         <w:r>
           <w:rPr>
             <w:rFonts w:ascii="Arial" w:eastAsia="MS Gothic" w:hAnsi="Arial" w:cs="Times New Roman (Headings CS)"/>
@@ -1547,11 +1564,11 @@
             <w:color w:val="auto"/>
             <w:sz w:val="22"/>
             <w:szCs w:val="28"/>
+            <w:u w:val="single"/>
             <w:lang w:eastAsia="en-US"/>
           </w:rPr>
-          <w:t>YemenIN</w:t>
+          <w:t>DVLD Management System</w:t>
         </w:r>
-        <w:proofErr w:type="spellEnd"/>
         <w:r>
           <w:rPr>
             <w:rFonts w:ascii="Arial" w:eastAsia="MS Gothic" w:hAnsi="Arial" w:cs="Times New Roman (Headings CS)"/>
@@ -1585,7 +1602,7 @@
           <w:szCs w:val="28"/>
           <w:lang w:eastAsia="en-US"/>
         </w:rPr>
-        <w:t>Oct</w:t>
+        <w:t>Dec</w:t>
       </w:r>
       <w:r>
         <w:rPr>
@@ -1596,7 +1613,7 @@
           <w:szCs w:val="28"/>
           <w:lang w:eastAsia="en-US"/>
         </w:rPr>
-        <w:t xml:space="preserve"> 2024 – </w:t>
+        <w:t xml:space="preserve"> 202</w:t>
       </w:r>
       <w:r>
         <w:rPr>
@@ -1607,7 +1624,7 @@
           <w:szCs w:val="28"/>
           <w:lang w:eastAsia="en-US"/>
         </w:rPr>
-        <w:t>Sep</w:t>
+        <w:t>5</w:t>
       </w:r>
       <w:r>
         <w:rPr>
@@ -1618,7 +1635,7 @@
           <w:szCs w:val="28"/>
           <w:lang w:eastAsia="en-US"/>
         </w:rPr>
-        <w:t xml:space="preserve"> 2025</w:t>
+        <w:t xml:space="preserve"> – </w:t>
       </w:r>
       <w:r>
         <w:rPr>
@@ -1629,6 +1646,39 @@
           <w:szCs w:val="28"/>
           <w:lang w:eastAsia="en-US"/>
         </w:rPr>
+        <w:t>May</w:t>
+      </w:r>
+      <w:r>
+        <w:rPr>
+          <w:rFonts w:ascii="Arial" w:eastAsia="MS Gothic" w:hAnsi="Arial" w:cs="Times New Roman (Headings CS)"/>
+          <w:b/>
+          <w:color w:val="auto"/>
+          <w:sz w:val="22"/>
+          <w:szCs w:val="28"/>
+          <w:lang w:eastAsia="en-US"/>
+        </w:rPr>
+        <w:t xml:space="preserve"> 202</w:t>
+      </w:r>
+      <w:r>
+        <w:rPr>
+          <w:rFonts w:ascii="Arial" w:eastAsia="MS Gothic" w:hAnsi="Arial" w:cs="Times New Roman (Headings CS)"/>
+          <w:b/>
+          <w:color w:val="auto"/>
+          <w:sz w:val="22"/>
+          <w:szCs w:val="28"/>
+          <w:lang w:eastAsia="en-US"/>
+        </w:rPr>
+        <w:t>6</w:t>
+      </w:r>
+      <w:r>
+        <w:rPr>
+          <w:rFonts w:ascii="Arial" w:eastAsia="MS Gothic" w:hAnsi="Arial" w:cs="Times New Roman (Headings CS)"/>
+          <w:b/>
+          <w:color w:val="auto"/>
+          <w:sz w:val="22"/>
+          <w:szCs w:val="28"/>
+          <w:lang w:eastAsia="en-US"/>
+        </w:rPr>
         <w:t>)</w:t>
       </w:r>
     </w:p>
@@ -1636,19 +1686,19 @@
       <w:pPr>
         <w:rPr>
           <w:rFonts w:ascii="Arial" w:eastAsia="Arial" w:hAnsi="Arial" w:cs="Arial"/>
-          <w:color w:val="000000"/>
-          <w:sz w:val="22"/>
-          <w:szCs w:val="24"/>
-        </w:rPr>
-      </w:pPr>
-      <w:r>
-        <w:rPr>
-          <w:rFonts w:ascii="Arial" w:eastAsia="Arial" w:hAnsi="Arial" w:cs="Arial"/>
-          <w:color w:val="000000"/>
-          <w:sz w:val="22"/>
-          <w:szCs w:val="24"/>
-        </w:rPr>
-        <w:t>A modern web platform that combines social media networking with AI-powered career guidance, designed as a beta simulation similar to LinkedIn.</w:t>
+          <w:color w:val="auto"/>
+          <w:sz w:val="22"/>
+          <w:szCs w:val="24"/>
+        </w:rPr>
+      </w:pPr>
+      <w:r>
+        <w:rPr>
+          <w:rFonts w:ascii="Arial" w:eastAsia="Arial" w:hAnsi="Arial" w:cs="Arial"/>
+          <w:color w:val="auto"/>
+          <w:sz w:val="22"/>
+          <w:szCs w:val="24"/>
+        </w:rPr>
+        <w:t>A comprehensive desktop management application built in C# and Windows Forms to digitize and automate the operations of the Driver and Vehicle Licensing Directorate (DVLD).</w:t>
       </w:r>
     </w:p>
     <w:p>
@@ -1658,7 +1708,7 @@
         <w:jc w:val="both"/>
         <w:rPr>
           <w:rFonts w:ascii="Arial" w:eastAsia="Arial" w:hAnsi="Arial" w:cs="Arial"/>
-          <w:color w:val="000000"/>
+          <w:color w:val="auto"/>
           <w:sz w:val="22"/>
           <w:szCs w:val="24"/>
         </w:rPr>
@@ -1668,7 +1718,7 @@
           <w:rFonts w:ascii="Segoe UI" w:eastAsia="MS Gothic" w:hAnsi="Segoe UI" w:cs="Segoe UI"/>
           <w:b/>
           <w:bCs/>
-          <w:color w:val="191919"/>
+          <w:color w:val="auto"/>
           <w:sz w:val="22"/>
           <w:szCs w:val="28"/>
         </w:rPr>
@@ -1677,7 +1727,7 @@
       <w:r>
         <w:rPr>
           <w:rFonts w:ascii="Segoe UI" w:eastAsia="MS Gothic" w:hAnsi="Segoe UI" w:cs="Segoe UI"/>
-          <w:color w:val="191919"/>
+          <w:color w:val="auto"/>
           <w:sz w:val="22"/>
           <w:szCs w:val="28"/>
         </w:rPr>
@@ -1686,11 +1736,11 @@
       <w:r>
         <w:rPr>
           <w:rFonts w:ascii="Arial" w:eastAsia="Arial" w:hAnsi="Arial" w:cs="Arial"/>
-          <w:color w:val="000000"/>
-          <w:sz w:val="22"/>
-          <w:szCs w:val="24"/>
-        </w:rPr>
-        <w:t>Livewire, Laravel, Alpine.js, Bootstrap and MySQL.</w:t>
+          <w:color w:val="auto"/>
+          <w:sz w:val="22"/>
+          <w:szCs w:val="24"/>
+        </w:rPr>
+        <w:t>C#, WinForms, SQL Server, ADO.NET.</w:t>
       </w:r>
     </w:p>
     <w:p>
@@ -1700,7 +1750,7 @@
         <w:jc w:val="both"/>
         <w:rPr>
           <w:rFonts w:ascii="Arial" w:eastAsia="Arial" w:hAnsi="Arial" w:cs="Arial"/>
-          <w:color w:val="000000"/>
+          <w:color w:val="auto"/>
           <w:sz w:val="22"/>
           <w:szCs w:val="24"/>
           <w:lang w:bidi="ar-YE"/>
@@ -1709,146 +1759,11 @@
       <w:r>
         <w:rPr>
           <w:rFonts w:ascii="Arial" w:eastAsia="Arial" w:hAnsi="Arial" w:cs="Arial"/>
-          <w:color w:val="000000"/>
-          <w:sz w:val="22"/>
-          <w:szCs w:val="24"/>
-        </w:rPr>
-        <w:t xml:space="preserve">As a team project I </w:t>
-      </w:r>
-      <w:r>
-        <w:rPr>
-          <w:rFonts w:ascii="Arial" w:eastAsia="Arial" w:hAnsi="Arial" w:cs="Arial"/>
-          <w:color w:val="000000"/>
-          <w:sz w:val="22"/>
-          <w:szCs w:val="24"/>
-        </w:rPr>
-        <w:t>participated in developing</w:t>
-      </w:r>
-      <w:r>
-        <w:rPr>
-          <w:rFonts w:ascii="Arial" w:eastAsia="Arial" w:hAnsi="Arial" w:cs="Arial"/>
-          <w:color w:val="000000"/>
-          <w:sz w:val="22"/>
-          <w:szCs w:val="24"/>
-        </w:rPr>
-        <w:t xml:space="preserve"> the Laravel/MySQL </w:t>
-      </w:r>
-      <w:r>
-        <w:rPr>
-          <w:rFonts w:ascii="Arial" w:eastAsia="Arial" w:hAnsi="Arial" w:cs="Arial"/>
-          <w:color w:val="000000"/>
-          <w:sz w:val="22"/>
-          <w:szCs w:val="24"/>
-        </w:rPr>
-        <w:t>tables schema</w:t>
-      </w:r>
-      <w:r>
-        <w:rPr>
-          <w:rFonts w:ascii="Arial" w:eastAsia="Arial" w:hAnsi="Arial" w:cs="Arial"/>
-          <w:color w:val="000000"/>
-          <w:sz w:val="22"/>
-          <w:szCs w:val="24"/>
-        </w:rPr>
-        <w:t xml:space="preserve"> and data model for posts, jobs, and </w:t>
-      </w:r>
-      <w:r>
-        <w:rPr>
-          <w:rFonts w:ascii="Arial" w:eastAsia="Arial" w:hAnsi="Arial" w:cs="Arial"/>
-          <w:color w:val="000000"/>
-          <w:sz w:val="22"/>
-          <w:szCs w:val="24"/>
-        </w:rPr>
-        <w:t>etc.</w:t>
-      </w:r>
-      <w:r>
-        <w:rPr>
-          <w:rFonts w:ascii="Arial" w:eastAsia="Arial" w:hAnsi="Arial" w:cs="Arial"/>
-          <w:color w:val="000000"/>
-          <w:sz w:val="22"/>
-          <w:szCs w:val="24"/>
-        </w:rPr>
-        <w:t xml:space="preserve"> </w:t>
-      </w:r>
-      <w:r>
-        <w:rPr>
-          <w:rFonts w:ascii="Arial" w:eastAsia="Arial" w:hAnsi="Arial" w:cs="Arial"/>
-          <w:color w:val="000000"/>
-          <w:sz w:val="22"/>
-          <w:szCs w:val="24"/>
-        </w:rPr>
-        <w:t>O</w:t>
-      </w:r>
-      <w:r>
-        <w:rPr>
-          <w:rFonts w:ascii="Arial" w:eastAsia="Arial" w:hAnsi="Arial" w:cs="Arial"/>
-          <w:color w:val="000000"/>
-          <w:sz w:val="22"/>
-          <w:szCs w:val="24"/>
-        </w:rPr>
-        <w:t>ptimized key queries and added indexes to reduce page load times noticeably.</w:t>
-      </w:r>
-      <w:r>
-        <w:rPr>
-          <w:rFonts w:ascii="Arial" w:eastAsia="Arial" w:hAnsi="Arial" w:cs="Arial"/>
-          <w:color w:val="000000"/>
-          <w:sz w:val="22"/>
-          <w:szCs w:val="24"/>
-        </w:rPr>
-        <w:t xml:space="preserve"> </w:t>
-      </w:r>
-      <w:r>
-        <w:rPr>
-          <w:rFonts w:ascii="Arial" w:eastAsia="Arial" w:hAnsi="Arial" w:cs="Arial"/>
-          <w:color w:val="000000"/>
-          <w:sz w:val="22"/>
-          <w:szCs w:val="24"/>
-        </w:rPr>
-        <w:t>I</w:t>
-      </w:r>
-      <w:r>
-        <w:rPr>
-          <w:rFonts w:ascii="Arial" w:eastAsia="Arial" w:hAnsi="Arial" w:cs="Arial"/>
-          <w:color w:val="000000"/>
-          <w:sz w:val="22"/>
-          <w:szCs w:val="24"/>
-        </w:rPr>
-        <w:t xml:space="preserve"> also</w:t>
-      </w:r>
-      <w:r>
-        <w:rPr>
-          <w:rFonts w:ascii="Arial" w:eastAsia="Arial" w:hAnsi="Arial" w:cs="Arial"/>
-          <w:color w:val="000000"/>
-          <w:sz w:val="22"/>
-          <w:szCs w:val="24"/>
-        </w:rPr>
-        <w:t xml:space="preserve"> i</w:t>
-      </w:r>
-      <w:r>
-        <w:rPr>
-          <w:rFonts w:ascii="Arial" w:eastAsia="Arial" w:hAnsi="Arial" w:cs="Arial"/>
-          <w:color w:val="000000"/>
-          <w:sz w:val="22"/>
-          <w:szCs w:val="24"/>
-        </w:rPr>
-        <w:t>mplemented real</w:t>
-      </w:r>
-      <w:r>
-        <w:rPr>
-          <w:rFonts w:ascii="Cambria Math" w:eastAsia="Arial" w:hAnsi="Cambria Math" w:cs="Cambria Math"/>
-          <w:color w:val="000000"/>
-          <w:sz w:val="22"/>
-          <w:szCs w:val="24"/>
-        </w:rPr>
-        <w:t>‑</w:t>
-      </w:r>
-      <w:r>
-        <w:rPr>
-          <w:rFonts w:ascii="Arial" w:eastAsia="Arial" w:hAnsi="Arial" w:cs="Arial"/>
-          <w:color w:val="000000"/>
-          <w:sz w:val="22"/>
-          <w:szCs w:val="24"/>
-        </w:rPr>
-        <w:t>time UI updates with Livewire + Alpine.js to enable instant post/comment reactions and live chat. Led integration of job postings into the main feed to increase discoverability and reduce navigation friction.</w:t>
+          <w:color w:val="auto"/>
+          <w:sz w:val="22"/>
+          <w:szCs w:val="24"/>
+        </w:rPr>
+        <w:t>Engineered an enterprise-grade DVLD management system using 3-Tier Architecture and ADO.NET. Automated complex workflows, including multi-stage testing pipelines and license lifecycles, while enforcing strict business rules and granular audit trails to ensure system-wide data integrity and accountability.</w:t>
       </w:r>
     </w:p>
     <w:p>
@@ -1859,12 +1774,220 @@
           <w:tab w:val="right" w:pos="9360"/>
         </w:tabs>
         <w:spacing w:before="180" w:after="0"/>
+        <w:outlineLvl w:val="1"/>
+        <w:rPr>
+          <w:rStyle w:val="Hyperlink"/>
+          <w:rFonts w:ascii="Arial" w:eastAsia="MS Gothic" w:hAnsi="Arial" w:cs="Times New Roman (Headings CS)"/>
+          <w:b/>
+          <w:color w:val="auto"/>
+          <w:sz w:val="22"/>
+          <w:szCs w:val="28"/>
+          <w:lang w:eastAsia="en-US"/>
+        </w:rPr>
+      </w:pPr>
+      <w:r>
+        <w:rPr>
+          <w:rFonts w:ascii="Arial" w:eastAsia="MS Gothic" w:hAnsi="Arial" w:cs="Times New Roman (Headings CS)"/>
+          <w:b/>
+          <w:color w:val="auto"/>
+          <w:sz w:val="22"/>
+          <w:szCs w:val="28"/>
+          <w:lang w:eastAsia="en-US"/>
+        </w:rPr>
+        <w:fldChar w:fldCharType="begin"/>
+      </w:r>
+      <w:r>
+        <w:rPr>
+          <w:rFonts w:ascii="Arial" w:eastAsia="MS Gothic" w:hAnsi="Arial" w:cs="Times New Roman (Headings CS)"/>
+          <w:b/>
+          <w:color w:val="auto"/>
+          <w:sz w:val="22"/>
+          <w:szCs w:val="28"/>
+          <w:lang w:eastAsia="en-US"/>
+        </w:rPr>
+        <w:instrText>HYPERLINK "https://github.com/amjad-jaloum/Ebda3Soft_AccountingSystem"</w:instrText>
+      </w:r>
+      <w:r>
+        <w:rPr>
+          <w:rFonts w:ascii="Arial" w:eastAsia="MS Gothic" w:hAnsi="Arial" w:cs="Times New Roman (Headings CS)"/>
+          <w:b/>
+          <w:color w:val="auto"/>
+          <w:sz w:val="22"/>
+          <w:szCs w:val="28"/>
+          <w:lang w:eastAsia="en-US"/>
+        </w:rPr>
+      </w:r>
+      <w:r>
+        <w:rPr>
+          <w:rFonts w:ascii="Arial" w:eastAsia="MS Gothic" w:hAnsi="Arial" w:cs="Times New Roman (Headings CS)"/>
+          <w:b/>
+          <w:color w:val="auto"/>
+          <w:sz w:val="22"/>
+          <w:szCs w:val="28"/>
+          <w:lang w:eastAsia="en-US"/>
+        </w:rPr>
+        <w:fldChar w:fldCharType="separate"/>
+      </w:r>
+      <w:r>
+        <w:rPr>
+          <w:rStyle w:val="Hyperlink"/>
+          <w:rFonts w:ascii="Arial" w:eastAsia="MS Gothic" w:hAnsi="Arial" w:cs="Times New Roman (Headings CS)"/>
+          <w:b/>
+          <w:color w:val="auto"/>
+          <w:sz w:val="22"/>
+          <w:szCs w:val="28"/>
+          <w:lang w:eastAsia="en-US"/>
+        </w:rPr>
+        <w:t>Ebda3Soft Accounting &amp; Inventory System</w:t>
+      </w:r>
+      <w:r>
+        <w:rPr>
+          <w:rStyle w:val="Hyperlink"/>
+          <w:rFonts w:ascii="Arial" w:eastAsia="MS Gothic" w:hAnsi="Arial" w:cs="Times New Roman (Headings CS)"/>
+          <w:b/>
+          <w:color w:val="auto"/>
+          <w:sz w:val="22"/>
+          <w:szCs w:val="28"/>
+          <w:u w:val="none"/>
+          <w:lang w:eastAsia="en-US"/>
+        </w:rPr>
+        <w:t xml:space="preserve"> </w:t>
+      </w:r>
+      <w:r>
+        <w:rPr>
+          <w:rStyle w:val="Hyperlink"/>
+          <w:rFonts w:ascii="Arial" w:eastAsia="Times New Roman" w:hAnsi="Arial" w:cs="Times New Roman (Headings CS)"/>
+          <w:b/>
+          <w:bCs/>
+          <w:color w:val="auto"/>
+          <w:sz w:val="22"/>
+          <w:szCs w:val="28"/>
+          <w:u w:val="none"/>
+          <w:lang w:eastAsia="en-US"/>
+        </w:rPr>
+        <w:t>(</w:t>
+      </w:r>
+      <w:r>
+        <w:rPr>
+          <w:rStyle w:val="Hyperlink"/>
+          <w:rFonts w:ascii="Arial" w:eastAsia="MS Gothic" w:hAnsi="Arial" w:cs="Times New Roman (Headings CS)"/>
+          <w:b/>
+          <w:color w:val="auto"/>
+          <w:sz w:val="22"/>
+          <w:szCs w:val="28"/>
+          <w:u w:val="none"/>
+          <w:lang w:eastAsia="en-US"/>
+        </w:rPr>
+        <w:t>May 2026 – May 2026)</w:t>
+      </w:r>
+    </w:p>
+    <w:p>
+      <w:pPr>
+        <w:rPr>
+          <w:rFonts w:ascii="Arial" w:eastAsia="Arial" w:hAnsi="Arial" w:cs="Arial"/>
+          <w:color w:val="auto"/>
+          <w:sz w:val="22"/>
+          <w:szCs w:val="24"/>
+        </w:rPr>
+      </w:pPr>
+      <w:r>
+        <w:rPr>
+          <w:rFonts w:ascii="Arial" w:eastAsia="MS Gothic" w:hAnsi="Arial" w:cs="Times New Roman (Headings CS)"/>
+          <w:b/>
+          <w:color w:val="auto"/>
+          <w:sz w:val="22"/>
+          <w:szCs w:val="28"/>
+          <w:lang w:eastAsia="en-US"/>
+        </w:rPr>
+        <w:fldChar w:fldCharType="end"/>
+      </w:r>
+      <w:r>
+        <w:rPr>
+          <w:rFonts w:ascii="Arial" w:eastAsia="Arial" w:hAnsi="Arial" w:cs="Arial"/>
+          <w:color w:val="auto"/>
+          <w:sz w:val="22"/>
+          <w:szCs w:val="24"/>
+        </w:rPr>
+        <w:t>A modular accounting and inventory management system built with C# and SQL Server to streamline financial tracking and stock control.</w:t>
+      </w:r>
+    </w:p>
+    <w:p>
+      <w:pPr>
+        <w:spacing w:after="80" w:line="276" w:lineRule="auto"/>
+        <w:ind w:left="450" w:hanging="360"/>
         <w:jc w:val="both"/>
+        <w:rPr>
+          <w:rFonts w:ascii="Arial" w:eastAsia="Arial" w:hAnsi="Arial" w:cs="Arial"/>
+          <w:color w:val="auto"/>
+          <w:sz w:val="22"/>
+          <w:szCs w:val="24"/>
+        </w:rPr>
+      </w:pPr>
+      <w:r>
+        <w:rPr>
+          <w:rFonts w:ascii="Segoe UI" w:eastAsia="MS Gothic" w:hAnsi="Segoe UI" w:cs="Segoe UI"/>
+          <w:b/>
+          <w:bCs/>
+          <w:color w:val="auto"/>
+          <w:sz w:val="22"/>
+          <w:szCs w:val="28"/>
+        </w:rPr>
+        <w:t>Tech</w:t>
+      </w:r>
+      <w:r>
+        <w:rPr>
+          <w:rFonts w:ascii="Segoe UI" w:eastAsia="MS Gothic" w:hAnsi="Segoe UI" w:cs="Segoe UI"/>
+          <w:color w:val="auto"/>
+          <w:sz w:val="22"/>
+          <w:szCs w:val="28"/>
+        </w:rPr>
+        <w:t xml:space="preserve">: </w:t>
+      </w:r>
+      <w:r>
+        <w:rPr>
+          <w:rFonts w:ascii="Arial" w:eastAsia="Arial" w:hAnsi="Arial" w:cs="Arial"/>
+          <w:color w:val="auto"/>
+          <w:sz w:val="22"/>
+          <w:szCs w:val="24"/>
+        </w:rPr>
+        <w:t>C#, WinForms, SQL Server, ADO.NET.</w:t>
+      </w:r>
+    </w:p>
+    <w:p>
+      <w:pPr>
+        <w:spacing w:after="80" w:line="276" w:lineRule="auto"/>
+        <w:ind w:left="114" w:hanging="24"/>
+        <w:jc w:val="both"/>
+        <w:rPr>
+          <w:rFonts w:ascii="Arial" w:eastAsia="Arial" w:hAnsi="Arial" w:cs="Arial"/>
+          <w:color w:val="auto"/>
+          <w:sz w:val="22"/>
+          <w:szCs w:val="24"/>
+          <w:lang w:bidi="ar-YE"/>
+        </w:rPr>
+      </w:pPr>
+      <w:r>
+        <w:rPr>
+          <w:rFonts w:ascii="Arial" w:eastAsia="Arial" w:hAnsi="Arial" w:cs="Arial"/>
+          <w:color w:val="auto"/>
+          <w:sz w:val="22"/>
+          <w:szCs w:val="24"/>
+        </w:rPr>
+        <w:t>Architected a comprehensive accounting and inventory management system using C# and SQL Server. Engineered core financial modules, including Vouchers, Sales/Purchase Invoices, and automated stock reporting. Implemented robust logic for financial statements and account balance generation, ensuring precise data accuracy and streamlined real-world accounting workflows.</w:t>
+      </w:r>
+    </w:p>
+    <w:p>
+      <w:pPr>
+        <w:keepNext/>
+        <w:keepLines/>
+        <w:tabs>
+          <w:tab w:val="right" w:pos="9360"/>
+        </w:tabs>
+        <w:spacing w:before="180" w:after="0"/>
         <w:outlineLvl w:val="1"/>
         <w:rPr>
-          <w:rFonts w:ascii="Arial" w:eastAsia="Times New Roman" w:hAnsi="Arial" w:cs="Times New Roman (Headings CS)"/>
-          <w:b/>
-          <w:bCs/>
+          <w:rFonts w:ascii="Arial" w:eastAsia="MS Gothic" w:hAnsi="Arial" w:cs="Times New Roman (Headings CS)"/>
+          <w:b/>
           <w:color w:val="auto"/>
           <w:sz w:val="22"/>
           <w:szCs w:val="28"/>
@@ -1872,7 +1995,18 @@
         </w:rPr>
       </w:pPr>
       <w:hyperlink r:id="rId9" w:history="1">
-        <w:proofErr w:type="spellStart"/>
+        <w:r>
+          <w:rPr>
+            <w:rFonts w:ascii="Arial" w:eastAsia="MS Gothic" w:hAnsi="Arial" w:cs="Times New Roman (Headings CS)"/>
+            <w:b/>
+            <w:color w:val="auto"/>
+            <w:sz w:val="22"/>
+            <w:szCs w:val="28"/>
+            <w:u w:val="single"/>
+            <w:lang w:eastAsia="en-US"/>
+          </w:rPr>
+          <w:t>YemenIN</w:t>
+        </w:r>
         <w:r>
           <w:rPr>
             <w:rFonts w:ascii="Arial" w:eastAsia="MS Gothic" w:hAnsi="Arial" w:cs="Times New Roman (Headings CS)"/>
@@ -1882,9 +2016,8 @@
             <w:szCs w:val="28"/>
             <w:lang w:eastAsia="en-US"/>
           </w:rPr>
-          <w:t>CareerAI</w:t>
+          <w:t xml:space="preserve"> </w:t>
         </w:r>
-        <w:proofErr w:type="spellEnd"/>
       </w:hyperlink>
       <w:r>
         <w:rPr>
@@ -1896,172 +2029,70 @@
           <w:szCs w:val="28"/>
           <w:lang w:eastAsia="en-US"/>
         </w:rPr>
-        <w:t xml:space="preserve"> </w:t>
-      </w:r>
-      <w:r>
-        <w:rPr>
-          <w:rFonts w:ascii="Arial" w:eastAsia="Times New Roman" w:hAnsi="Arial" w:cs="Times New Roman (Headings CS)"/>
-          <w:b/>
-          <w:bCs/>
-          <w:color w:val="auto"/>
-          <w:sz w:val="22"/>
-          <w:szCs w:val="28"/>
-          <w:lang w:eastAsia="en-US"/>
-        </w:rPr>
         <w:t>(</w:t>
       </w:r>
       <w:r>
         <w:rPr>
-          <w:rFonts w:ascii="Arial" w:eastAsia="Times New Roman" w:hAnsi="Arial" w:cs="Times New Roman (Headings CS)"/>
-          <w:b/>
-          <w:bCs/>
-          <w:color w:val="auto"/>
-          <w:sz w:val="22"/>
-          <w:szCs w:val="28"/>
-          <w:lang w:eastAsia="en-US"/>
-        </w:rPr>
-        <w:t>Mar</w:t>
-      </w:r>
-      <w:r>
-        <w:rPr>
-          <w:rFonts w:ascii="Arial" w:eastAsia="Times New Roman" w:hAnsi="Arial" w:cs="Times New Roman (Headings CS)"/>
-          <w:b/>
-          <w:bCs/>
-          <w:color w:val="auto"/>
-          <w:sz w:val="22"/>
-          <w:szCs w:val="28"/>
-          <w:lang w:eastAsia="en-US"/>
-        </w:rPr>
-        <w:t xml:space="preserve"> </w:t>
-      </w:r>
-      <w:r>
-        <w:rPr>
-          <w:rFonts w:ascii="Arial" w:eastAsia="Times New Roman" w:hAnsi="Arial" w:cs="Times New Roman (Headings CS)"/>
-          <w:b/>
-          <w:bCs/>
-          <w:color w:val="auto"/>
-          <w:sz w:val="22"/>
-          <w:szCs w:val="28"/>
-          <w:lang w:eastAsia="en-US"/>
-        </w:rPr>
-        <w:t>2025</w:t>
-      </w:r>
-      <w:r>
-        <w:rPr>
-          <w:rFonts w:ascii="Arial" w:eastAsia="Times New Roman" w:hAnsi="Arial" w:cs="Times New Roman (Headings CS)"/>
-          <w:b/>
-          <w:bCs/>
-          <w:color w:val="auto"/>
-          <w:sz w:val="22"/>
-          <w:szCs w:val="28"/>
-          <w:lang w:eastAsia="en-US"/>
-        </w:rPr>
-        <w:t xml:space="preserve"> – </w:t>
-      </w:r>
-      <w:r>
-        <w:rPr>
-          <w:rFonts w:ascii="Arial" w:eastAsia="Times New Roman" w:hAnsi="Arial" w:cs="Times New Roman (Headings CS)"/>
-          <w:b/>
-          <w:bCs/>
-          <w:color w:val="auto"/>
-          <w:sz w:val="22"/>
-          <w:szCs w:val="28"/>
-          <w:lang w:eastAsia="en-US"/>
-        </w:rPr>
-        <w:t>Mar</w:t>
-      </w:r>
-      <w:r>
-        <w:rPr>
-          <w:rFonts w:ascii="Arial" w:eastAsia="Times New Roman" w:hAnsi="Arial" w:cs="Times New Roman (Headings CS)"/>
-          <w:b/>
-          <w:bCs/>
-          <w:color w:val="auto"/>
-          <w:sz w:val="22"/>
-          <w:szCs w:val="28"/>
-          <w:lang w:eastAsia="en-US"/>
-        </w:rPr>
-        <w:t xml:space="preserve"> 2025</w:t>
-      </w:r>
-      <w:r>
-        <w:rPr>
-          <w:rFonts w:ascii="Arial" w:eastAsia="Times New Roman" w:hAnsi="Arial" w:cs="Times New Roman (Headings CS)"/>
-          <w:b/>
-          <w:bCs/>
-          <w:color w:val="auto"/>
-          <w:sz w:val="22"/>
-          <w:szCs w:val="28"/>
-          <w:lang w:eastAsia="en-US"/>
-        </w:rPr>
-        <w:t>)</w:t>
-      </w:r>
-    </w:p>
-    <w:p>
-      <w:pPr>
-        <w:spacing w:after="80" w:line="276" w:lineRule="auto"/>
-        <w:ind w:left="142"/>
-        <w:jc w:val="both"/>
-        <w:rPr>
-          <w:rFonts w:ascii="Arial" w:eastAsia="Arial" w:hAnsi="Arial" w:cs="Arial"/>
-          <w:b/>
-          <w:bCs/>
-          <w:color w:val="000000"/>
-          <w:sz w:val="22"/>
-          <w:szCs w:val="24"/>
-        </w:rPr>
-      </w:pPr>
-      <w:r>
-        <w:rPr>
-          <w:rFonts w:ascii="Arial" w:eastAsia="Arial" w:hAnsi="Arial" w:cs="Arial"/>
-          <w:color w:val="000000"/>
-          <w:sz w:val="22"/>
-          <w:szCs w:val="24"/>
-        </w:rPr>
-        <w:t>A modern</w:t>
-      </w:r>
-      <w:r>
-        <w:rPr>
-          <w:rFonts w:ascii="Arial" w:eastAsia="Arial" w:hAnsi="Arial" w:cs="Arial"/>
-          <w:color w:val="000000"/>
-          <w:sz w:val="22"/>
-          <w:szCs w:val="24"/>
-        </w:rPr>
-        <w:t xml:space="preserve"> AI-powered career guidance</w:t>
-      </w:r>
-      <w:r>
-        <w:rPr>
-          <w:rFonts w:ascii="Arial" w:eastAsia="Arial" w:hAnsi="Arial" w:cs="Arial"/>
-          <w:color w:val="000000"/>
-          <w:sz w:val="22"/>
-          <w:szCs w:val="24"/>
-        </w:rPr>
-        <w:t xml:space="preserve"> web platform</w:t>
-      </w:r>
-      <w:r>
-        <w:rPr>
-          <w:rFonts w:ascii="Arial" w:eastAsia="Arial" w:hAnsi="Arial" w:cs="Arial"/>
-          <w:color w:val="000000"/>
-          <w:sz w:val="22"/>
-          <w:szCs w:val="24"/>
-        </w:rPr>
-        <w:t xml:space="preserve">, CV and job description analysis with </w:t>
-      </w:r>
-      <w:r>
-        <w:rPr>
-          <w:rFonts w:ascii="Arial" w:eastAsia="Arial" w:hAnsi="Arial" w:cs="Arial"/>
-          <w:color w:val="000000"/>
-          <w:sz w:val="22"/>
-          <w:szCs w:val="24"/>
-        </w:rPr>
-        <w:t>interactive Q&amp;A modules to improve candidate readiness</w:t>
-      </w:r>
-      <w:r>
-        <w:rPr>
-          <w:rFonts w:ascii="Arial" w:eastAsia="Arial" w:hAnsi="Arial" w:cs="Arial"/>
-          <w:color w:val="000000"/>
-          <w:sz w:val="22"/>
-          <w:szCs w:val="24"/>
-        </w:rPr>
-        <w:t xml:space="preserve">. </w:t>
+          <w:rFonts w:ascii="Arial" w:eastAsia="MS Gothic" w:hAnsi="Arial" w:cs="Times New Roman (Headings CS)"/>
+          <w:b/>
+          <w:color w:val="auto"/>
+          <w:sz w:val="22"/>
+          <w:szCs w:val="28"/>
+          <w:lang w:eastAsia="en-US"/>
+        </w:rPr>
+        <w:t>Oct</w:t>
+      </w:r>
+      <w:r>
+        <w:rPr>
+          <w:rFonts w:ascii="Arial" w:eastAsia="MS Gothic" w:hAnsi="Arial" w:cs="Times New Roman (Headings CS)"/>
+          <w:b/>
+          <w:color w:val="auto"/>
+          <w:sz w:val="22"/>
+          <w:szCs w:val="28"/>
+          <w:lang w:eastAsia="en-US"/>
+        </w:rPr>
+        <w:t xml:space="preserve"> 2024 – </w:t>
+      </w:r>
+      <w:r>
+        <w:rPr>
+          <w:rFonts w:ascii="Arial" w:eastAsia="MS Gothic" w:hAnsi="Arial" w:cs="Times New Roman (Headings CS)"/>
+          <w:b/>
+          <w:color w:val="auto"/>
+          <w:sz w:val="22"/>
+          <w:szCs w:val="28"/>
+          <w:lang w:eastAsia="en-US"/>
+        </w:rPr>
+        <w:t>Sep</w:t>
+      </w:r>
+      <w:r>
+        <w:rPr>
+          <w:rFonts w:ascii="Arial" w:eastAsia="MS Gothic" w:hAnsi="Arial" w:cs="Times New Roman (Headings CS)"/>
+          <w:b/>
+          <w:color w:val="auto"/>
+          <w:sz w:val="22"/>
+          <w:szCs w:val="28"/>
+          <w:lang w:eastAsia="en-US"/>
+        </w:rPr>
+        <w:t xml:space="preserve"> 2025)</w:t>
+      </w:r>
+    </w:p>
+    <w:p>
+      <w:pPr>
+        <w:rPr>
+          <w:rFonts w:ascii="Arial" w:eastAsia="Arial" w:hAnsi="Arial" w:cs="Arial"/>
+          <w:color w:val="000000"/>
+          <w:sz w:val="22"/>
+          <w:szCs w:val="24"/>
+        </w:rPr>
+      </w:pPr>
+      <w:r>
+        <w:rPr>
+          <w:rFonts w:ascii="Arial" w:eastAsia="Arial" w:hAnsi="Arial" w:cs="Arial"/>
+          <w:color w:val="000000"/>
+          <w:sz w:val="22"/>
+          <w:szCs w:val="24"/>
+        </w:rPr>
+        <w:t>A modern web platform that combines social media networking with AI-powered career guidance, designed as a beta simulation similar to LinkedIn.</w:t>
       </w:r>
     </w:p>
     <w:p>
@@ -2078,142 +2109,154 @@
       </w:pPr>
       <w:r>
         <w:rPr>
-          <w:rFonts w:ascii="Arial" w:eastAsia="Arial" w:hAnsi="Arial" w:cs="Arial"/>
+          <w:rFonts w:ascii="Segoe UI" w:eastAsia="MS Gothic" w:hAnsi="Segoe UI" w:cs="Segoe UI"/>
           <w:b/>
           <w:bCs/>
-          <w:color w:val="000000"/>
-          <w:sz w:val="22"/>
-          <w:szCs w:val="24"/>
+          <w:color w:val="191919"/>
+          <w:sz w:val="22"/>
+          <w:szCs w:val="28"/>
         </w:rPr>
         <w:t>Tech</w:t>
       </w:r>
       <w:r>
         <w:rPr>
-          <w:rFonts w:ascii="Arial" w:eastAsia="Arial" w:hAnsi="Arial" w:cs="Arial"/>
-          <w:color w:val="000000"/>
-          <w:sz w:val="22"/>
-          <w:szCs w:val="24"/>
-        </w:rPr>
-        <w:t>: Laravel, Livewire, Alpine.js, MySQL</w:t>
+          <w:rFonts w:ascii="Segoe UI" w:eastAsia="MS Gothic" w:hAnsi="Segoe UI" w:cs="Segoe UI"/>
+          <w:color w:val="191919"/>
+          <w:sz w:val="22"/>
+          <w:szCs w:val="28"/>
+        </w:rPr>
+        <w:t xml:space="preserve">: </w:t>
+      </w:r>
+      <w:r>
+        <w:rPr>
+          <w:rFonts w:ascii="Arial" w:eastAsia="Arial" w:hAnsi="Arial" w:cs="Arial"/>
+          <w:color w:val="000000"/>
+          <w:sz w:val="22"/>
+          <w:szCs w:val="24"/>
+        </w:rPr>
+        <w:t>Livewire, Laravel, Alpine.js, Bootstrap and MySQL.</w:t>
       </w:r>
     </w:p>
     <w:p>
       <w:pPr>
         <w:spacing w:after="80" w:line="276" w:lineRule="auto"/>
-        <w:ind w:left="142"/>
+        <w:ind w:left="114" w:hanging="24"/>
         <w:jc w:val="both"/>
         <w:rPr>
           <w:rFonts w:ascii="Arial" w:eastAsia="Arial" w:hAnsi="Arial" w:cs="Arial"/>
           <w:color w:val="000000"/>
           <w:sz w:val="22"/>
           <w:szCs w:val="24"/>
-        </w:rPr>
-      </w:pPr>
-      <w:r>
-        <w:rPr>
-          <w:rFonts w:ascii="Arial" w:eastAsia="Arial" w:hAnsi="Arial" w:cs="Arial"/>
-          <w:color w:val="000000"/>
-          <w:sz w:val="22"/>
-          <w:szCs w:val="24"/>
-        </w:rPr>
-        <w:t xml:space="preserve">As a </w:t>
-      </w:r>
-      <w:r>
-        <w:rPr>
-          <w:rFonts w:ascii="Arial" w:eastAsia="Times New Roman" w:hAnsi="Arial" w:cs="Times New Roman (Headings CS)"/>
-          <w:color w:val="auto"/>
-          <w:sz w:val="22"/>
-          <w:szCs w:val="28"/>
-          <w:lang w:eastAsia="en-US"/>
-        </w:rPr>
-        <w:t>7</w:t>
-      </w:r>
-      <w:r>
-        <w:rPr>
-          <w:rFonts w:ascii="Cambria Math" w:eastAsia="Times New Roman" w:hAnsi="Cambria Math" w:cs="Cambria Math"/>
-          <w:color w:val="auto"/>
-          <w:sz w:val="22"/>
-          <w:szCs w:val="28"/>
-          <w:lang w:eastAsia="en-US"/>
+          <w:lang w:bidi="ar-YE"/>
+        </w:rPr>
+      </w:pPr>
+      <w:r>
+        <w:rPr>
+          <w:rFonts w:ascii="Arial" w:eastAsia="Arial" w:hAnsi="Arial" w:cs="Arial"/>
+          <w:color w:val="000000"/>
+          <w:sz w:val="22"/>
+          <w:szCs w:val="24"/>
+        </w:rPr>
+        <w:t>As a team project I participated in developing</w:t>
+      </w:r>
+      <w:r>
+        <w:rPr>
+          <w:rFonts w:ascii="Arial" w:eastAsia="Arial" w:hAnsi="Arial" w:cs="Arial"/>
+          <w:color w:val="000000"/>
+          <w:sz w:val="22"/>
+          <w:szCs w:val="24"/>
+        </w:rPr>
+        <w:t xml:space="preserve"> the Laravel/MySQL </w:t>
+      </w:r>
+      <w:r>
+        <w:rPr>
+          <w:rFonts w:ascii="Arial" w:eastAsia="Arial" w:hAnsi="Arial" w:cs="Arial"/>
+          <w:color w:val="000000"/>
+          <w:sz w:val="22"/>
+          <w:szCs w:val="24"/>
+        </w:rPr>
+        <w:t>tables schema</w:t>
+      </w:r>
+      <w:r>
+        <w:rPr>
+          <w:rFonts w:ascii="Arial" w:eastAsia="Arial" w:hAnsi="Arial" w:cs="Arial"/>
+          <w:color w:val="000000"/>
+          <w:sz w:val="22"/>
+          <w:szCs w:val="24"/>
+        </w:rPr>
+        <w:t xml:space="preserve"> and data model for posts, jobs, and </w:t>
+      </w:r>
+      <w:r>
+        <w:rPr>
+          <w:rFonts w:ascii="Arial" w:eastAsia="Arial" w:hAnsi="Arial" w:cs="Arial"/>
+          <w:color w:val="000000"/>
+          <w:sz w:val="22"/>
+          <w:szCs w:val="24"/>
+        </w:rPr>
+        <w:t>etc.</w:t>
+      </w:r>
+      <w:r>
+        <w:rPr>
+          <w:rFonts w:ascii="Arial" w:eastAsia="Arial" w:hAnsi="Arial" w:cs="Arial"/>
+          <w:color w:val="000000"/>
+          <w:sz w:val="22"/>
+          <w:szCs w:val="24"/>
+        </w:rPr>
+        <w:t xml:space="preserve"> </w:t>
+      </w:r>
+      <w:r>
+        <w:rPr>
+          <w:rFonts w:ascii="Arial" w:eastAsia="Arial" w:hAnsi="Arial" w:cs="Arial"/>
+          <w:color w:val="000000"/>
+          <w:sz w:val="22"/>
+          <w:szCs w:val="24"/>
+        </w:rPr>
+        <w:t>O</w:t>
+      </w:r>
+      <w:r>
+        <w:rPr>
+          <w:rFonts w:ascii="Arial" w:eastAsia="Arial" w:hAnsi="Arial" w:cs="Arial"/>
+          <w:color w:val="000000"/>
+          <w:sz w:val="22"/>
+          <w:szCs w:val="24"/>
+        </w:rPr>
+        <w:t>ptimized key queries and added indexes to reduce page load times noticeably.</w:t>
+      </w:r>
+      <w:r>
+        <w:rPr>
+          <w:rFonts w:ascii="Arial" w:eastAsia="Arial" w:hAnsi="Arial" w:cs="Arial"/>
+          <w:color w:val="000000"/>
+          <w:sz w:val="22"/>
+          <w:szCs w:val="24"/>
+        </w:rPr>
+        <w:t xml:space="preserve"> I also i</w:t>
+      </w:r>
+      <w:r>
+        <w:rPr>
+          <w:rFonts w:ascii="Arial" w:eastAsia="Arial" w:hAnsi="Arial" w:cs="Arial"/>
+          <w:color w:val="000000"/>
+          <w:sz w:val="22"/>
+          <w:szCs w:val="24"/>
+        </w:rPr>
+        <w:t>mplemented real</w:t>
+      </w:r>
+      <w:r>
+        <w:rPr>
+          <w:rFonts w:ascii="Cambria Math" w:eastAsia="Arial" w:hAnsi="Cambria Math" w:cs="Cambria Math"/>
+          <w:color w:val="000000"/>
+          <w:sz w:val="22"/>
+          <w:szCs w:val="24"/>
         </w:rPr>
         <w:t>‑</w:t>
       </w:r>
       <w:r>
         <w:rPr>
-          <w:rFonts w:ascii="Arial" w:eastAsia="Times New Roman" w:hAnsi="Arial" w:cs="Times New Roman (Headings CS)"/>
-          <w:color w:val="auto"/>
-          <w:sz w:val="22"/>
-          <w:szCs w:val="28"/>
-          <w:lang w:eastAsia="en-US"/>
-        </w:rPr>
-        <w:t>days Hackathon project</w:t>
-      </w:r>
-      <w:r>
-        <w:rPr>
-          <w:rFonts w:ascii="Arial" w:eastAsia="Arial" w:hAnsi="Arial" w:cs="Arial"/>
-          <w:color w:val="000000"/>
-          <w:sz w:val="22"/>
-          <w:szCs w:val="24"/>
-        </w:rPr>
-        <w:t xml:space="preserve"> I</w:t>
-      </w:r>
-      <w:r>
-        <w:rPr>
-          <w:rFonts w:ascii="Arial" w:eastAsia="Arial" w:hAnsi="Arial" w:cs="Arial"/>
-          <w:color w:val="000000"/>
-          <w:sz w:val="22"/>
-          <w:szCs w:val="24"/>
-        </w:rPr>
-        <w:t xml:space="preserve"> </w:t>
-      </w:r>
-      <w:r>
-        <w:rPr>
-          <w:rFonts w:ascii="Arial" w:eastAsia="Arial" w:hAnsi="Arial" w:cs="Arial"/>
-          <w:color w:val="000000"/>
-          <w:sz w:val="22"/>
-          <w:szCs w:val="24"/>
-        </w:rPr>
-        <w:t>Implemented</w:t>
-      </w:r>
-      <w:r>
-        <w:rPr>
-          <w:rFonts w:ascii="Arial" w:eastAsia="Arial" w:hAnsi="Arial" w:cs="Arial"/>
-          <w:b/>
-          <w:bCs/>
-          <w:color w:val="000000"/>
-          <w:sz w:val="22"/>
-          <w:szCs w:val="24"/>
-        </w:rPr>
-        <w:t xml:space="preserve"> </w:t>
-      </w:r>
-      <w:r>
-        <w:rPr>
-          <w:rFonts w:ascii="Arial" w:eastAsia="Arial" w:hAnsi="Arial" w:cs="Arial"/>
-          <w:color w:val="000000"/>
-          <w:sz w:val="22"/>
-          <w:szCs w:val="24"/>
-        </w:rPr>
-        <w:t xml:space="preserve">Backend systems + dynamic UI components. </w:t>
-      </w:r>
-      <w:r>
-        <w:rPr>
-          <w:rFonts w:ascii="Arial" w:eastAsia="Arial" w:hAnsi="Arial" w:cs="Arial"/>
-          <w:b/>
-          <w:bCs/>
-          <w:color w:val="000000"/>
-          <w:sz w:val="22"/>
-          <w:szCs w:val="24"/>
-        </w:rPr>
-        <w:t>Competed in Slam Hack 2025</w:t>
-      </w:r>
-      <w:r>
-        <w:rPr>
-          <w:rFonts w:ascii="Arial" w:eastAsia="Arial" w:hAnsi="Arial" w:cs="Arial"/>
-          <w:color w:val="000000"/>
-          <w:sz w:val="22"/>
-          <w:szCs w:val="24"/>
-        </w:rPr>
-        <w:t xml:space="preserve">, delivering a functional prototype in 7 days.  </w:t>
+          <w:rFonts w:ascii="Arial" w:eastAsia="Arial" w:hAnsi="Arial" w:cs="Arial"/>
+          <w:color w:val="000000"/>
+          <w:sz w:val="22"/>
+          <w:szCs w:val="24"/>
+        </w:rPr>
+        <w:t>time UI updates with Livewire + Alpine.js to enable instant post/comment reactions and live chat. Led integration of job postings into the main feed to increase discoverability and reduce navigation friction.</w:t>
       </w:r>
     </w:p>
     <w:p>
@@ -2335,7 +2378,7 @@
       <w:pPr>
         <w:numPr>
           <w:ilvl w:val="0"/>
-          <w:numId w:val="4"/>
+          <w:numId w:val="8"/>
         </w:numPr>
         <w:shd w:val="clear" w:color="auto" w:fill="FFFFFF"/>
         <w:spacing w:after="60"/>
@@ -2359,7 +2402,7 @@
           <w:sz w:val="22"/>
           <w:szCs w:val="24"/>
         </w:rPr>
-        <w:t>C# &amp; Database Connectivity (Dec 2025):</w:t>
+        <w:t>Full Real Project - DVLD (May 2026):</w:t>
       </w:r>
     </w:p>
     <w:p>
@@ -2382,17 +2425,7 @@
           <w:sz w:val="22"/>
           <w:lang w:eastAsia="en-US"/>
         </w:rPr>
-        <w:t>Implemented database connectivity in C# using ADO.NET and applied 3</w:t>
-      </w:r>
-      <w:r>
-        <w:rPr>
-          <w:rFonts w:ascii="Segoe UI" w:eastAsia="Times New Roman" w:hAnsi="Segoe UI" w:cs="Segoe UI"/>
-          <w:color w:val="auto"/>
-          <w:sz w:val="22"/>
-          <w:lang w:eastAsia="en-US"/>
-        </w:rPr>
-        <w:noBreakHyphen/>
-        <w:t>Tier Architecture for scalable solutions.</w:t>
+        <w:t>Implemented an end-to-end desktop management system for the Driver and Vehicle Licensing Directorate (DVLD). Applied 3-Tier Architecture and ADO.NET for secure database connectivity, developed multi-stage testing workflows, and enforced complex business rules to ensure data integrity and scalable performance.</w:t>
       </w:r>
     </w:p>
     <w:p>
@@ -2423,7 +2456,7 @@
           <w:sz w:val="22"/>
           <w:szCs w:val="24"/>
         </w:rPr>
-        <w:t>SQL (Projects &amp; Practice) - Level 1 (Oct 2025):</w:t>
+        <w:t>C# &amp; Database Connectivity (Dec 2025):</w:t>
       </w:r>
     </w:p>
     <w:p>
@@ -2446,7 +2479,17 @@
           <w:sz w:val="22"/>
           <w:lang w:eastAsia="en-US"/>
         </w:rPr>
-        <w:t>Completed a SQL course focused on real-world database scenarios, including query optimization, multi-table joins, and practical data manipulation.</w:t>
+        <w:t>Implemented database connectivity in C# using ADO.NET and applied 3</w:t>
+      </w:r>
+      <w:r>
+        <w:rPr>
+          <w:rFonts w:ascii="Segoe UI" w:eastAsia="Times New Roman" w:hAnsi="Segoe UI" w:cs="Segoe UI"/>
+          <w:color w:val="auto"/>
+          <w:sz w:val="22"/>
+          <w:lang w:eastAsia="en-US"/>
+        </w:rPr>
+        <w:noBreakHyphen/>
+        <w:t>Tier Architecture for scalable solutions.</w:t>
       </w:r>
     </w:p>
     <w:p>
@@ -2477,7 +2520,7 @@
           <w:sz w:val="22"/>
           <w:szCs w:val="24"/>
         </w:rPr>
-        <w:t>OOP As It Should Be in C# (Sep 2025):</w:t>
+        <w:t>SQL (Projects &amp; Practice) - Level 1 (Oct 2025):</w:t>
       </w:r>
     </w:p>
     <w:p>
@@ -2487,23 +2530,21 @@
         <w:ind w:left="360"/>
         <w:jc w:val="both"/>
         <w:rPr>
-          <w:rFonts w:ascii="Times New Roman" w:eastAsia="Arial" w:hAnsi="Times New Roman" w:cs="Times New Roman"/>
-          <w:b/>
-          <w:bCs/>
-          <w:color w:val="auto"/>
-          <w:sz w:val="22"/>
-          <w:szCs w:val="24"/>
-          <w:lang w:eastAsia="en-US"/>
-        </w:rPr>
-      </w:pPr>
-      <w:r>
-        <w:rPr>
           <w:rFonts w:ascii="Segoe UI" w:eastAsia="Times New Roman" w:hAnsi="Segoe UI" w:cs="Segoe UI"/>
           <w:color w:val="auto"/>
           <w:sz w:val="22"/>
           <w:lang w:eastAsia="en-US"/>
         </w:rPr>
-        <w:t>Explored object-oriented programming principles through a modern C# lens, focusing on clean architecture, encapsulation, inheritance, and polymorphism. Gained practical experience in building maintainable and scalable applications using best practices in OOP design.</w:t>
+      </w:pPr>
+      <w:r>
+        <w:rPr>
+          <w:rFonts w:ascii="Segoe UI" w:eastAsia="Times New Roman" w:hAnsi="Segoe UI" w:cs="Segoe UI"/>
+          <w:color w:val="auto"/>
+          <w:sz w:val="22"/>
+          <w:lang w:eastAsia="en-US"/>
+        </w:rPr>
+        <w:lastRenderedPageBreak/>
+        <w:t>Completed a SQL course focused on real-world database scenarios, including query optimization, multi-table joins, and practical data manipulation.</w:t>
       </w:r>
     </w:p>
     <w:p>
@@ -2534,7 +2575,7 @@
           <w:sz w:val="22"/>
           <w:szCs w:val="24"/>
         </w:rPr>
-        <w:t>SQL &amp; Databases - Level 1 (Aug 2025):</w:t>
+        <w:t>OOP As It Should Be in C# (Sep 2025):</w:t>
       </w:r>
     </w:p>
     <w:p>
@@ -2544,20 +2585,23 @@
         <w:ind w:left="360"/>
         <w:jc w:val="both"/>
         <w:rPr>
+          <w:rFonts w:ascii="Times New Roman" w:eastAsia="Arial" w:hAnsi="Times New Roman" w:cs="Times New Roman"/>
+          <w:b/>
+          <w:bCs/>
+          <w:color w:val="auto"/>
+          <w:sz w:val="22"/>
+          <w:szCs w:val="24"/>
+          <w:lang w:eastAsia="en-US"/>
+        </w:rPr>
+      </w:pPr>
+      <w:r>
+        <w:rPr>
           <w:rFonts w:ascii="Segoe UI" w:eastAsia="Times New Roman" w:hAnsi="Segoe UI" w:cs="Segoe UI"/>
           <w:color w:val="auto"/>
           <w:sz w:val="22"/>
           <w:lang w:eastAsia="en-US"/>
         </w:rPr>
-      </w:pPr>
-      <w:r>
-        <w:rPr>
-          <w:rFonts w:ascii="Segoe UI" w:eastAsia="Times New Roman" w:hAnsi="Segoe UI" w:cs="Segoe UI"/>
-          <w:color w:val="auto"/>
-          <w:sz w:val="22"/>
-          <w:lang w:eastAsia="en-US"/>
-        </w:rPr>
-        <w:t>Mastered fundamental database concepts and SQL syntax, gained proficiency in writing complex queries for data retrieval and manipulation, and developed skills in database design and management as a core foundation for data-driven application development.</w:t>
+        <w:t>Explored object-oriented programming principles through a modern C# lens, focusing on clean architecture, encapsulation, inheritance, and polymorphism. Gained practical experience in building maintainable and scalable applications using best practices in OOP design.</w:t>
       </w:r>
     </w:p>
     <w:p>
@@ -2588,7 +2632,7 @@
           <w:sz w:val="22"/>
           <w:szCs w:val="24"/>
         </w:rPr>
-        <w:t>C# - Level 1 (Jul 2025):</w:t>
+        <w:t>SQL &amp; Databases - Level 1 (Aug 2025):</w:t>
       </w:r>
     </w:p>
     <w:p>
@@ -2611,31 +2655,7 @@
           <w:sz w:val="22"/>
           <w:lang w:eastAsia="en-US"/>
         </w:rPr>
-        <w:t>Learned C# programming rules and professional basics, gained desktop app development skills using Windows Forms, and explored advanced programming concepts as a foundation for comprehensive technical solutions (for Web, Mobile, etc.).</w:t>
-      </w:r>
-    </w:p>
-    <w:p>
-      <w:pPr>
-        <w:spacing w:after="160" w:line="259" w:lineRule="auto"/>
-        <w:rPr>
-          <w:rFonts w:ascii="Arial" w:eastAsia="Arial" w:hAnsi="Arial" w:cs="Arial"/>
-          <w:b/>
-          <w:bCs/>
-          <w:color w:val="000000"/>
-          <w:sz w:val="22"/>
-          <w:szCs w:val="24"/>
-        </w:rPr>
-      </w:pPr>
-      <w:r>
-        <w:rPr>
-          <w:rFonts w:ascii="Arial" w:eastAsia="Arial" w:hAnsi="Arial" w:cs="Arial"/>
-          <w:b/>
-          <w:bCs/>
-          <w:color w:val="000000"/>
-          <w:sz w:val="22"/>
-          <w:szCs w:val="24"/>
-        </w:rPr>
-        <w:br w:type="page"/>
+        <w:t>Mastered fundamental database concepts and SQL syntax, gained proficiency in writing complex queries for data retrieval and manipulation, and developed skills in database design and management as a core foundation for data-driven application development.</w:t>
       </w:r>
     </w:p>
     <w:p>
@@ -2666,7 +2686,60 @@
           <w:sz w:val="22"/>
           <w:szCs w:val="24"/>
         </w:rPr>
-        <w:lastRenderedPageBreak/>
+        <w:t>C# - Level 1 (Jul 2025):</w:t>
+      </w:r>
+    </w:p>
+    <w:p>
+      <w:pPr>
+        <w:shd w:val="clear" w:color="auto" w:fill="FFFFFF"/>
+        <w:spacing w:after="0"/>
+        <w:ind w:left="360"/>
+        <w:jc w:val="both"/>
+        <w:rPr>
+          <w:rFonts w:ascii="Segoe UI" w:eastAsia="Times New Roman" w:hAnsi="Segoe UI" w:cs="Segoe UI"/>
+          <w:color w:val="auto"/>
+          <w:sz w:val="22"/>
+          <w:lang w:eastAsia="en-US"/>
+        </w:rPr>
+      </w:pPr>
+      <w:r>
+        <w:rPr>
+          <w:rFonts w:ascii="Segoe UI" w:eastAsia="Times New Roman" w:hAnsi="Segoe UI" w:cs="Segoe UI"/>
+          <w:color w:val="auto"/>
+          <w:sz w:val="22"/>
+          <w:lang w:eastAsia="en-US"/>
+        </w:rPr>
+        <w:t>Learned C# programming rules and professional basics, gained desktop app development skills using Windows Forms, and explored advanced programming concepts as a foundation for comprehensive technical solutions (for Web, Mobile, etc.).</w:t>
+      </w:r>
+    </w:p>
+    <w:p>
+      <w:pPr>
+        <w:numPr>
+          <w:ilvl w:val="0"/>
+          <w:numId w:val="4"/>
+        </w:numPr>
+        <w:shd w:val="clear" w:color="auto" w:fill="FFFFFF"/>
+        <w:spacing w:after="60" w:line="429" w:lineRule="atLeast"/>
+        <w:ind w:left="360"/>
+        <w:jc w:val="both"/>
+        <w:rPr>
+          <w:rFonts w:ascii="Arial" w:eastAsia="Arial" w:hAnsi="Arial" w:cs="Arial"/>
+          <w:b/>
+          <w:bCs/>
+          <w:color w:val="000000"/>
+          <w:sz w:val="22"/>
+          <w:szCs w:val="24"/>
+        </w:rPr>
+      </w:pPr>
+      <w:r>
+        <w:rPr>
+          <w:rFonts w:ascii="Arial" w:eastAsia="Arial" w:hAnsi="Arial" w:cs="Arial"/>
+          <w:b/>
+          <w:bCs/>
+          <w:color w:val="000000"/>
+          <w:sz w:val="22"/>
+          <w:szCs w:val="24"/>
+        </w:rPr>
         <w:t>Algorithms &amp; Problem-Solving (Levels 2–5):</w:t>
       </w:r>
     </w:p>
@@ -3433,7 +3506,6 @@
       </w:r>
       <w:bookmarkEnd w:id="0"/>
     </w:p>
-    <w:p/>
     <w:sectPr>
       <w:pgSz w:w="12240" w:h="15840"/>
       <w:pgMar w:top="720" w:right="720" w:bottom="720" w:left="720" w:header="708" w:footer="708" w:gutter="0"/>
@@ -4330,6 +4402,18 @@
   </w:num>
   <w:num w:numId="7" w16cid:durableId="1871071789">
     <w:abstractNumId w:val="5"/>
+  </w:num>
+  <w:num w:numId="8" w16cid:durableId="970407533">
+    <w:abstractNumId w:val="4"/>
+    <w:lvlOverride w:ilvl="0"/>
+    <w:lvlOverride w:ilvl="1"/>
+    <w:lvlOverride w:ilvl="2"/>
+    <w:lvlOverride w:ilvl="3"/>
+    <w:lvlOverride w:ilvl="4"/>
+    <w:lvlOverride w:ilvl="5"/>
+    <w:lvlOverride w:ilvl="6"/>
+    <w:lvlOverride w:ilvl="7"/>
+    <w:lvlOverride w:ilvl="8"/>
   </w:num>
 </w:numbering>
 </file>
@@ -4951,6 +5035,18 @@
       <w:lang w:eastAsia="en-US"/>
     </w:rPr>
   </w:style>
+  <w:style w:type="character" w:styleId="UnresolvedMention">
+    <w:name w:val="Unresolved Mention"/>
+    <w:basedOn w:val="DefaultParagraphFont"/>
+    <w:uiPriority w:val="99"/>
+    <w:semiHidden/>
+    <w:unhideWhenUsed/>
+    <w:rsid w:val="001130D0"/>
+    <w:rPr>
+      <w:color w:val="605E5C"/>
+      <w:shd w:val="clear" w:color="auto" w:fill="E1DFDD"/>
+    </w:rPr>
+  </w:style>
 </w:styles>
 </file>
 

</xml_diff>